<commit_message>
Modificación del documento Sistema de Gestión de Estudiantes.docx
</commit_message>
<xml_diff>
--- a/docs/Sistema de Gestión de Estudiantes (SGE) – Documentación y estructura.docx
+++ b/docs/Sistema de Gestión de Estudiantes (SGE) – Documentación y estructura.docx
@@ -2929,7 +2929,43 @@
           <w:lang w:val="es-CO"/>
         </w:rPr>
         <w:lastRenderedPageBreak/>
-        <w:t>3.3 Diagrama de secuencia: registrar una calificación (CU-05)</w:t>
+        <w:t xml:space="preserve">3.3 Diagrama de secuencia: </w:t>
+      </w:r>
+      <w:r>
+        <w:rPr>
+          <w:lang w:val="es-CO"/>
+        </w:rPr>
+        <w:t xml:space="preserve">gestionar </w:t>
+      </w:r>
+      <w:r>
+        <w:rPr>
+          <w:lang w:val="es-CO"/>
+        </w:rPr>
+        <w:t>estudiante</w:t>
+      </w:r>
+      <w:r>
+        <w:rPr>
+          <w:lang w:val="es-CO"/>
+        </w:rPr>
+        <w:t>s</w:t>
+      </w:r>
+      <w:r>
+        <w:rPr>
+          <w:lang w:val="es-CO"/>
+        </w:rPr>
+        <w:t xml:space="preserve"> (CU-0</w:t>
+      </w:r>
+      <w:r>
+        <w:rPr>
+          <w:lang w:val="es-CO"/>
+        </w:rPr>
+        <w:t>2</w:t>
+      </w:r>
+      <w:r>
+        <w:rPr>
+          <w:lang w:val="es-CO"/>
+        </w:rPr>
+        <w:t>)</w:t>
       </w:r>
     </w:p>
     <w:p>
@@ -2951,18 +2987,18 @@
           <w:lang w:val="es-CO"/>
         </w:rPr>
         <w:drawing>
-          <wp:anchor distT="0" distB="0" distL="114300" distR="114300" simplePos="0" relativeHeight="251659776" behindDoc="0" locked="0" layoutInCell="1" allowOverlap="1" wp14:anchorId="0E3E7622" wp14:editId="7F98F43D">
+          <wp:anchor distT="0" distB="0" distL="114300" distR="114300" simplePos="0" relativeHeight="251668480" behindDoc="0" locked="0" layoutInCell="1" allowOverlap="1" wp14:anchorId="210D1E1B" wp14:editId="19AF1836">
             <wp:simplePos x="0" y="0"/>
             <wp:positionH relativeFrom="column">
-              <wp:posOffset>-129540</wp:posOffset>
+              <wp:posOffset>-289560</wp:posOffset>
             </wp:positionH>
             <wp:positionV relativeFrom="paragraph">
-              <wp:posOffset>171450</wp:posOffset>
+              <wp:posOffset>72390</wp:posOffset>
             </wp:positionV>
-            <wp:extent cx="5928360" cy="3253740"/>
+            <wp:extent cx="5943600" cy="3886200"/>
             <wp:effectExtent l="0" t="0" r="0" b="0"/>
             <wp:wrapNone/>
-            <wp:docPr id="1551681047" name="Imagen 1"/>
+            <wp:docPr id="27012033" name="Imagen 1"/>
             <wp:cNvGraphicFramePr>
               <a:graphicFrameLocks xmlns:a="http://schemas.openxmlformats.org/drawingml/2006/main" noChangeAspect="1"/>
             </wp:cNvGraphicFramePr>
@@ -2991,7 +3027,7 @@
                   <pic:spPr bwMode="auto">
                     <a:xfrm>
                       <a:off x="0" y="0"/>
-                      <a:ext cx="5928360" cy="3253740"/>
+                      <a:ext cx="5943600" cy="3886200"/>
                     </a:xfrm>
                     <a:prstGeom prst="rect">
                       <a:avLst/>
@@ -3224,19 +3260,7 @@
     <w:p>
       <w:pPr>
         <w:pStyle w:val="Prrafodelista"/>
-        <w:numPr>
-          <w:ilvl w:val="0"/>
-          <w:numId w:val="3"/>
-        </w:numPr>
-      </w:pPr>
-      <w:proofErr w:type="spellStart"/>
-      <w:r>
-        <w:t>Interfaz</w:t>
-      </w:r>
-      <w:proofErr w:type="spellEnd"/>
-      <w:r>
-        <w:t xml:space="preserve"> web completa con API REST.</w:t>
-      </w:r>
+      </w:pPr>
     </w:p>
     <w:sectPr>
       <w:pgSz w:w="12240" w:h="15840"/>

</xml_diff>

<commit_message>
Modificación del documento Sistema de Gestión de Estudiantes.docx y anexo en formato PDF
</commit_message>
<xml_diff>
--- a/docs/Sistema de Gestión de Estudiantes (SGE) – Documentación y estructura.docx
+++ b/docs/Sistema de Gestión de Estudiantes (SGE) – Documentación y estructura.docx
@@ -5,112 +5,177 @@
     <w:p>
       <w:pPr>
         <w:pStyle w:val="Ttulo1"/>
-        <w:rPr>
-          <w:lang w:val="es-CO"/>
-        </w:rPr>
-      </w:pPr>
-      <w:r>
-        <w:rPr>
-          <w:lang w:val="es-CO"/>
-        </w:rPr>
-        <w:t>Sistema de Gestión de Estudiantes (SGE)</w:t>
-      </w:r>
-    </w:p>
-    <w:p>
-      <w:pPr>
-        <w:rPr>
-          <w:lang w:val="es-CO"/>
-        </w:rPr>
-      </w:pPr>
-      <w:r>
-        <w:rPr>
-          <w:lang w:val="es-CO"/>
-        </w:rPr>
-        <w:t>Documentación base · Versión 0.1 (versión básica, diseñada para ampliarse)</w:t>
-      </w:r>
-    </w:p>
-    <w:p>
-      <w:pPr>
-        <w:pStyle w:val="Ttulo2"/>
-        <w:rPr>
-          <w:lang w:val="es-CO"/>
-        </w:rPr>
-      </w:pPr>
-      <w:r>
-        <w:rPr>
-          <w:lang w:val="es-CO"/>
-        </w:rPr>
-        <w:t>1. Descripción del proyecto</w:t>
-      </w:r>
-    </w:p>
-    <w:p>
-      <w:pPr>
-        <w:rPr>
-          <w:lang w:val="es-CO"/>
-        </w:rPr>
-      </w:pPr>
-      <w:r>
+      </w:pPr>
+      <w:r>
+        <w:t>UNIVERSIDAD TECNOLÓGICA DE PEREIRA</w:t>
+      </w:r>
+    </w:p>
+    <w:p>
+      <w:pPr>
         <w:rPr>
           <w:b/>
-          <w:lang w:val="es-CO"/>
-        </w:rPr>
-        <w:t>Nombre del sistema:</w:t>
-      </w:r>
-      <w:r>
-        <w:rPr>
-          <w:lang w:val="es-CO"/>
-        </w:rPr>
-        <w:t xml:space="preserve"> SGE – Sistema de Gestión de Estudiantes.</w:t>
-      </w:r>
-    </w:p>
-    <w:p>
-      <w:pPr>
-        <w:rPr>
-          <w:lang w:val="es-CO"/>
+          <w:bCs/>
+          <w:sz w:val="28"/>
+          <w:szCs w:val="28"/>
         </w:rPr>
       </w:pPr>
       <w:r>
         <w:rPr>
           <w:b/>
-          <w:lang w:val="es-CO"/>
+          <w:bCs/>
+          <w:sz w:val="28"/>
+          <w:szCs w:val="28"/>
         </w:rPr>
-        <w:t>Problema que resuelve:</w:t>
-      </w:r>
-      <w:r>
+        <w:t>Entornos de Desarrollo de Software</w:t>
+      </w:r>
+    </w:p>
+    <w:p>
+      <w:pPr>
         <w:rPr>
-          <w:lang w:val="es-CO"/>
+          <w:sz w:val="24"/>
+          <w:szCs w:val="24"/>
         </w:rPr>
-        <w:t xml:space="preserve"> En muchas instituciones educativas pequeñas la información de los estudiantes (datos personales, matrículas, materias y notas) se lleva en hojas de cálculo o en papel. Esto genera datos duplicados, errores en las notas, pérdida de información y demora al consultar el historial académico. El SGE centraliza esta información en un solo sistema, con acceso controlado según el rol de cada persona.</w:t>
-      </w:r>
-    </w:p>
-    <w:p>
-      <w:proofErr w:type="spellStart"/>
+      </w:pPr>
+      <w:r>
+        <w:rPr>
+          <w:sz w:val="24"/>
+          <w:szCs w:val="24"/>
+        </w:rPr>
+        <w:t xml:space="preserve">Docente: </w:t>
+      </w:r>
+      <w:r>
+        <w:rPr>
+          <w:sz w:val="24"/>
+          <w:szCs w:val="24"/>
+        </w:rPr>
+        <w:t>Juan Camilo Olarte Betancourt</w:t>
+      </w:r>
+    </w:p>
+    <w:p>
+      <w:pPr>
+        <w:rPr>
+          <w:sz w:val="24"/>
+          <w:szCs w:val="24"/>
+        </w:rPr>
+      </w:pPr>
+      <w:r>
+        <w:rPr>
+          <w:sz w:val="24"/>
+          <w:szCs w:val="24"/>
+        </w:rPr>
+        <w:t>Integrantes: Jorge Luis Arguelles – Edilson Andrés Trejos</w:t>
+      </w:r>
+    </w:p>
+    <w:p>
+      <w:pPr>
+        <w:rPr>
+          <w:sz w:val="24"/>
+          <w:szCs w:val="24"/>
+        </w:rPr>
+      </w:pPr>
+      <w:r>
+        <w:rPr>
+          <w:sz w:val="24"/>
+          <w:szCs w:val="24"/>
+        </w:rPr>
+        <w:t>Fecha de presentación: 13/10/2026</w:t>
+      </w:r>
+    </w:p>
+    <w:p>
+      <w:pPr>
+        <w:rPr>
+          <w:sz w:val="24"/>
+          <w:szCs w:val="24"/>
+        </w:rPr>
+      </w:pPr>
+      <w:r>
+        <w:rPr>
+          <w:sz w:val="24"/>
+          <w:szCs w:val="24"/>
+        </w:rPr>
+        <w:t>El contexto que defin</w:t>
+      </w:r>
+      <w:r>
+        <w:rPr>
+          <w:sz w:val="24"/>
+          <w:szCs w:val="24"/>
+        </w:rPr>
+        <w:t>imos</w:t>
+      </w:r>
+      <w:r>
+        <w:rPr>
+          <w:sz w:val="24"/>
+          <w:szCs w:val="24"/>
+        </w:rPr>
+        <w:t xml:space="preserve"> en la documentación es el de una </w:t>
+      </w:r>
+      <w:r>
+        <w:rPr>
+          <w:b/>
+          <w:bCs/>
+          <w:sz w:val="24"/>
+          <w:szCs w:val="24"/>
+        </w:rPr>
+        <w:t>institución educativa pequeña</w:t>
+      </w:r>
+      <w:r>
+        <w:rPr>
+          <w:sz w:val="24"/>
+          <w:szCs w:val="24"/>
+        </w:rPr>
+        <w:t xml:space="preserve"> (colegio, academia o instituto de formación) que hoy lleva la información de sus estudiantes en hojas de cálculo o en papel.</w:t>
+      </w:r>
+    </w:p>
+    <w:p>
+      <w:pPr>
+        <w:pStyle w:val="Ttulo1"/>
+      </w:pPr>
+      <w:r>
+        <w:t>Sistema de Gestión de Estudiantes (SGE)</w:t>
+      </w:r>
+    </w:p>
+    <w:p>
+      <w:r>
+        <w:t>Documentación base · Versión 0.1</w:t>
+      </w:r>
+    </w:p>
+    <w:p/>
+    <w:p>
+      <w:pPr>
+        <w:pStyle w:val="Ttulo2"/>
+      </w:pPr>
+      <w:r>
+        <w:t>1. Descripción del proyecto</w:t>
+      </w:r>
+    </w:p>
+    <w:p>
       <w:r>
         <w:rPr>
           <w:b/>
         </w:rPr>
-        <w:t>Usuarios</w:t>
-      </w:r>
-      <w:proofErr w:type="spellEnd"/>
+        <w:t>Nombre del sistema:</w:t>
+      </w:r>
+      <w:r>
+        <w:t xml:space="preserve"> SGE – Sistema de Gestión de Estudiantes.</w:t>
+      </w:r>
+    </w:p>
+    <w:p>
       <w:r>
         <w:rPr>
           <w:b/>
         </w:rPr>
-        <w:t xml:space="preserve"> del </w:t>
-      </w:r>
-      <w:proofErr w:type="spellStart"/>
+        <w:t>Problema que resuelve:</w:t>
+      </w:r>
+      <w:r>
+        <w:t xml:space="preserve"> En muchas instituciones educativas pequeñas la información de los estudiantes (datos personales, matrículas, materias y notas) se lleva en hojas de cálculo o en papel. Esto genera datos duplicados, errores en las notas, pérdida de información y demora al consultar el historial académico. El SGE centraliza esta información en un solo sistema, con acceso controlado según el rol de cada persona.</w:t>
+      </w:r>
+    </w:p>
+    <w:p>
       <w:r>
         <w:rPr>
           <w:b/>
         </w:rPr>
-        <w:t>sistema</w:t>
-      </w:r>
-      <w:proofErr w:type="spellEnd"/>
-      <w:r>
-        <w:rPr>
-          <w:b/>
-        </w:rPr>
-        <w:t>:</w:t>
+        <w:t>Usuarios del sistema:</w:t>
       </w:r>
     </w:p>
     <w:tbl>
@@ -134,11 +199,9 @@
             <w:shd w:val="clear" w:color="auto" w:fill="F2F2F2"/>
           </w:tcPr>
           <w:p>
-            <w:proofErr w:type="spellStart"/>
             <w:r>
               <w:t>Usuario</w:t>
             </w:r>
-            <w:proofErr w:type="spellEnd"/>
           </w:p>
         </w:tc>
         <w:tc>
@@ -147,11 +210,9 @@
             <w:shd w:val="clear" w:color="auto" w:fill="F2F2F2"/>
           </w:tcPr>
           <w:p>
-            <w:proofErr w:type="spellStart"/>
             <w:r>
               <w:t>Descripción</w:t>
             </w:r>
-            <w:proofErr w:type="spellEnd"/>
           </w:p>
         </w:tc>
       </w:tr>
@@ -161,11 +222,9 @@
             <w:tcW w:w="4680" w:type="dxa"/>
           </w:tcPr>
           <w:p>
-            <w:proofErr w:type="spellStart"/>
             <w:r>
               <w:t>Administrador</w:t>
             </w:r>
-            <w:proofErr w:type="spellEnd"/>
           </w:p>
         </w:tc>
         <w:tc>
@@ -173,15 +232,7 @@
             <w:tcW w:w="4680" w:type="dxa"/>
           </w:tcPr>
           <w:p>
-            <w:pPr>
-              <w:rPr>
-                <w:lang w:val="es-CO"/>
-              </w:rPr>
-            </w:pPr>
-            <w:r>
-              <w:rPr>
-                <w:lang w:val="es-CO"/>
-              </w:rPr>
+            <w:r>
               <w:t>Configura el sistema, gestiona usuarios, cursos y periodos académicos.</w:t>
             </w:r>
           </w:p>
@@ -193,11 +244,9 @@
             <w:tcW w:w="4680" w:type="dxa"/>
           </w:tcPr>
           <w:p>
-            <w:proofErr w:type="spellStart"/>
             <w:r>
               <w:t>Docente</w:t>
             </w:r>
-            <w:proofErr w:type="spellEnd"/>
           </w:p>
         </w:tc>
         <w:tc>
@@ -205,15 +254,7 @@
             <w:tcW w:w="4680" w:type="dxa"/>
           </w:tcPr>
           <w:p>
-            <w:pPr>
-              <w:rPr>
-                <w:lang w:val="es-CO"/>
-              </w:rPr>
-            </w:pPr>
-            <w:r>
-              <w:rPr>
-                <w:lang w:val="es-CO"/>
-              </w:rPr>
+            <w:r>
               <w:t>Consulta sus cursos y estudiantes, registra y modifica notas.</w:t>
             </w:r>
           </w:p>
@@ -225,11 +266,9 @@
             <w:tcW w:w="4680" w:type="dxa"/>
           </w:tcPr>
           <w:p>
-            <w:proofErr w:type="spellStart"/>
             <w:r>
               <w:t>Estudiante</w:t>
             </w:r>
-            <w:proofErr w:type="spellEnd"/>
           </w:p>
         </w:tc>
         <w:tc>
@@ -237,15 +276,7 @@
             <w:tcW w:w="4680" w:type="dxa"/>
           </w:tcPr>
           <w:p>
-            <w:pPr>
-              <w:rPr>
-                <w:lang w:val="es-CO"/>
-              </w:rPr>
-            </w:pPr>
-            <w:r>
-              <w:rPr>
-                <w:lang w:val="es-CO"/>
-              </w:rPr>
+            <w:r>
               <w:t>Consulta su información personal, sus cursos y sus calificaciones.</w:t>
             </w:r>
           </w:p>
@@ -253,33 +284,18 @@
       </w:tr>
     </w:tbl>
     <w:p>
-      <w:proofErr w:type="spellStart"/>
-      <w:r>
+      <w:pPr>
         <w:rPr>
           <w:b/>
         </w:rPr>
-        <w:t>Funcionalidades</w:t>
-      </w:r>
-      <w:proofErr w:type="spellEnd"/>
+      </w:pPr>
+    </w:p>
+    <w:p>
       <w:r>
         <w:rPr>
           <w:b/>
         </w:rPr>
-        <w:t xml:space="preserve"> </w:t>
-      </w:r>
-      <w:proofErr w:type="spellStart"/>
-      <w:r>
-        <w:rPr>
-          <w:b/>
-        </w:rPr>
-        <w:t>principales</w:t>
-      </w:r>
-      <w:proofErr w:type="spellEnd"/>
-      <w:r>
-        <w:rPr>
-          <w:b/>
-        </w:rPr>
-        <w:t>:</w:t>
+        <w:t>Funcionalidades principales:</w:t>
       </w:r>
     </w:p>
     <w:p>
@@ -289,14 +305,8 @@
           <w:ilvl w:val="0"/>
           <w:numId w:val="2"/>
         </w:numPr>
-        <w:rPr>
-          <w:lang w:val="es-CO"/>
-        </w:rPr>
-      </w:pPr>
-      <w:r>
-        <w:rPr>
-          <w:lang w:val="es-CO"/>
-        </w:rPr>
+      </w:pPr>
+      <w:r>
         <w:t>Inicio de sesión con roles y permisos.</w:t>
       </w:r>
     </w:p>
@@ -307,14 +317,8 @@
           <w:ilvl w:val="0"/>
           <w:numId w:val="2"/>
         </w:numPr>
-        <w:rPr>
-          <w:lang w:val="es-CO"/>
-        </w:rPr>
-      </w:pPr>
-      <w:r>
-        <w:rPr>
-          <w:lang w:val="es-CO"/>
-        </w:rPr>
+      </w:pPr>
+      <w:r>
         <w:t>Registro, consulta, edición y baja de estudiantes.</w:t>
       </w:r>
     </w:p>
@@ -325,14 +329,9 @@
           <w:ilvl w:val="0"/>
           <w:numId w:val="2"/>
         </w:numPr>
-        <w:rPr>
-          <w:lang w:val="es-CO"/>
-        </w:rPr>
-      </w:pPr>
-      <w:r>
-        <w:rPr>
-          <w:lang w:val="es-CO"/>
-        </w:rPr>
+      </w:pPr>
+      <w:r>
+        <w:lastRenderedPageBreak/>
         <w:t>Gestión de cursos (materias) y asignación de docentes.</w:t>
       </w:r>
     </w:p>
@@ -343,14 +342,8 @@
           <w:ilvl w:val="0"/>
           <w:numId w:val="2"/>
         </w:numPr>
-        <w:rPr>
-          <w:lang w:val="es-CO"/>
-        </w:rPr>
-      </w:pPr>
-      <w:r>
-        <w:rPr>
-          <w:lang w:val="es-CO"/>
-        </w:rPr>
+      </w:pPr>
+      <w:r>
         <w:t>Matrícula de estudiantes en cursos.</w:t>
       </w:r>
     </w:p>
@@ -361,14 +354,8 @@
           <w:ilvl w:val="0"/>
           <w:numId w:val="2"/>
         </w:numPr>
-        <w:rPr>
-          <w:lang w:val="es-CO"/>
-        </w:rPr>
-      </w:pPr>
-      <w:r>
-        <w:rPr>
-          <w:lang w:val="es-CO"/>
-        </w:rPr>
+      </w:pPr>
+      <w:r>
         <w:t>Registro y consulta de calificaciones.</w:t>
       </w:r>
     </w:p>
@@ -379,14 +366,8 @@
           <w:ilvl w:val="0"/>
           <w:numId w:val="2"/>
         </w:numPr>
-        <w:rPr>
-          <w:lang w:val="es-CO"/>
-        </w:rPr>
-      </w:pPr>
-      <w:r>
-        <w:rPr>
-          <w:lang w:val="es-CO"/>
-        </w:rPr>
+      </w:pPr>
+      <w:r>
         <w:t>Generación de reportes básicos (listado de estudiantes por curso, boletín de notas).</w:t>
       </w:r>
     </w:p>
@@ -394,50 +375,11 @@
       <w:r>
         <w:rPr>
           <w:b/>
-          <w:lang w:val="es-CO"/>
         </w:rPr>
         <w:t>Fuera del alcance de la versión 0.1:</w:t>
       </w:r>
       <w:r>
-        <w:rPr>
-          <w:lang w:val="es-CO"/>
-        </w:rPr>
-        <w:t xml:space="preserve"> pagos, control de asistencia, notificaciones por correo, aplicación móvil. </w:t>
-      </w:r>
-      <w:r>
-        <w:t xml:space="preserve">Se </w:t>
-      </w:r>
-      <w:proofErr w:type="spellStart"/>
-      <w:r>
-        <w:t>dejan</w:t>
-      </w:r>
-      <w:proofErr w:type="spellEnd"/>
-      <w:r>
-        <w:t xml:space="preserve"> </w:t>
-      </w:r>
-      <w:proofErr w:type="spellStart"/>
-      <w:r>
-        <w:t>como</w:t>
-      </w:r>
-      <w:proofErr w:type="spellEnd"/>
-      <w:r>
-        <w:t xml:space="preserve"> </w:t>
-      </w:r>
-      <w:proofErr w:type="spellStart"/>
-      <w:r>
-        <w:t>mejoras</w:t>
-      </w:r>
-      <w:proofErr w:type="spellEnd"/>
-      <w:r>
-        <w:t xml:space="preserve"> </w:t>
-      </w:r>
-      <w:proofErr w:type="spellStart"/>
-      <w:r>
-        <w:t>futuras</w:t>
-      </w:r>
-      <w:proofErr w:type="spellEnd"/>
-      <w:r>
-        <w:t>.</w:t>
+        <w:t xml:space="preserve"> pagos, control de asistencia, notificaciones por correo, aplicación móvil. Se dejan como mejoras futuras.</w:t>
       </w:r>
     </w:p>
     <w:p>
@@ -445,34 +387,17 @@
         <w:pStyle w:val="Ttulo2"/>
       </w:pPr>
       <w:r>
-        <w:t xml:space="preserve">2. </w:t>
-      </w:r>
-      <w:proofErr w:type="spellStart"/>
-      <w:r>
-        <w:t>Análisis</w:t>
-      </w:r>
-      <w:proofErr w:type="spellEnd"/>
-      <w:r>
-        <w:t xml:space="preserve"> del </w:t>
-      </w:r>
-      <w:proofErr w:type="spellStart"/>
-      <w:r>
-        <w:t>sistema</w:t>
-      </w:r>
-      <w:proofErr w:type="spellEnd"/>
-    </w:p>
+        <w:t>2. Análisis del sistema</w:t>
+      </w:r>
+    </w:p>
+    <w:p/>
     <w:p>
       <w:pPr>
         <w:pStyle w:val="Ttulo3"/>
       </w:pPr>
       <w:r>
-        <w:t xml:space="preserve">2.1 </w:t>
-      </w:r>
-      <w:proofErr w:type="spellStart"/>
-      <w:r>
-        <w:t>Actores</w:t>
-      </w:r>
-      <w:proofErr w:type="spellEnd"/>
+        <w:t>2.1 Actores</w:t>
+      </w:r>
     </w:p>
     <w:tbl>
       <w:tblPr>
@@ -507,21 +432,8 @@
           </w:tcPr>
           <w:p>
             <w:r>
-              <w:t xml:space="preserve">Rol </w:t>
-            </w:r>
-            <w:proofErr w:type="spellStart"/>
-            <w:r>
-              <w:t>en</w:t>
-            </w:r>
-            <w:proofErr w:type="spellEnd"/>
-            <w:r>
-              <w:t xml:space="preserve"> el </w:t>
-            </w:r>
-            <w:proofErr w:type="spellStart"/>
-            <w:r>
-              <w:t>sistema</w:t>
-            </w:r>
-            <w:proofErr w:type="spellEnd"/>
+              <w:t>Rol en el sistema</w:t>
+            </w:r>
           </w:p>
         </w:tc>
       </w:tr>
@@ -531,11 +443,9 @@
             <w:tcW w:w="4680" w:type="dxa"/>
           </w:tcPr>
           <w:p>
-            <w:proofErr w:type="spellStart"/>
             <w:r>
               <w:t>Administrador</w:t>
             </w:r>
-            <w:proofErr w:type="spellEnd"/>
           </w:p>
         </w:tc>
         <w:tc>
@@ -543,15 +453,7 @@
             <w:tcW w:w="4680" w:type="dxa"/>
           </w:tcPr>
           <w:p>
-            <w:pPr>
-              <w:rPr>
-                <w:lang w:val="es-CO"/>
-              </w:rPr>
-            </w:pPr>
-            <w:r>
-              <w:rPr>
-                <w:lang w:val="es-CO"/>
-              </w:rPr>
+            <w:r>
               <w:t>Gestiona usuarios, estudiantes, cursos y matrículas.</w:t>
             </w:r>
           </w:p>
@@ -563,12 +465,9 @@
             <w:tcW w:w="4680" w:type="dxa"/>
           </w:tcPr>
           <w:p>
-            <w:proofErr w:type="spellStart"/>
-            <w:r>
-              <w:lastRenderedPageBreak/>
+            <w:r>
               <w:t>Docente</w:t>
             </w:r>
-            <w:proofErr w:type="spellEnd"/>
           </w:p>
         </w:tc>
         <w:tc>
@@ -576,15 +475,7 @@
             <w:tcW w:w="4680" w:type="dxa"/>
           </w:tcPr>
           <w:p>
-            <w:pPr>
-              <w:rPr>
-                <w:lang w:val="es-CO"/>
-              </w:rPr>
-            </w:pPr>
-            <w:r>
-              <w:rPr>
-                <w:lang w:val="es-CO"/>
-              </w:rPr>
+            <w:r>
               <w:t>Registra notas y consulta listas de sus cursos.</w:t>
             </w:r>
           </w:p>
@@ -596,11 +487,9 @@
             <w:tcW w:w="4680" w:type="dxa"/>
           </w:tcPr>
           <w:p>
-            <w:proofErr w:type="spellStart"/>
             <w:r>
               <w:t>Estudiante</w:t>
             </w:r>
-            <w:proofErr w:type="spellEnd"/>
           </w:p>
         </w:tc>
         <w:tc>
@@ -608,15 +497,7 @@
             <w:tcW w:w="4680" w:type="dxa"/>
           </w:tcPr>
           <w:p>
-            <w:pPr>
-              <w:rPr>
-                <w:lang w:val="es-CO"/>
-              </w:rPr>
-            </w:pPr>
-            <w:r>
-              <w:rPr>
-                <w:lang w:val="es-CO"/>
-              </w:rPr>
+            <w:r>
               <w:t>Consulta su perfil, sus cursos y sus notas.</w:t>
             </w:r>
           </w:p>
@@ -627,22 +508,14 @@
       <w:pPr>
         <w:pStyle w:val="Ttulo3"/>
       </w:pPr>
-      <w:r>
-        <w:t xml:space="preserve">2.2 Casos de </w:t>
-      </w:r>
-      <w:proofErr w:type="spellStart"/>
-      <w:r>
-        <w:t>uso</w:t>
-      </w:r>
-      <w:proofErr w:type="spellEnd"/>
-      <w:r>
-        <w:t xml:space="preserve"> </w:t>
-      </w:r>
-      <w:proofErr w:type="spellStart"/>
-      <w:r>
-        <w:t>principales</w:t>
-      </w:r>
-      <w:proofErr w:type="spellEnd"/>
+    </w:p>
+    <w:p>
+      <w:pPr>
+        <w:pStyle w:val="Ttulo3"/>
+      </w:pPr>
+      <w:r>
+        <w:t>2.2 Casos de uso principales</w:t>
+      </w:r>
     </w:p>
     <w:tbl>
       <w:tblPr>
@@ -678,13 +551,8 @@
           </w:tcPr>
           <w:p>
             <w:r>
-              <w:t xml:space="preserve">Caso de </w:t>
-            </w:r>
-            <w:proofErr w:type="spellStart"/>
-            <w:r>
-              <w:t>uso</w:t>
-            </w:r>
-            <w:proofErr w:type="spellEnd"/>
+              <w:t>Caso de uso</w:t>
+            </w:r>
           </w:p>
         </w:tc>
         <w:tc>
@@ -715,19 +583,9 @@
             <w:tcW w:w="3120" w:type="dxa"/>
           </w:tcPr>
           <w:p>
-            <w:proofErr w:type="spellStart"/>
-            <w:r>
-              <w:t>Iniciar</w:t>
-            </w:r>
-            <w:proofErr w:type="spellEnd"/>
-            <w:r>
-              <w:t xml:space="preserve"> </w:t>
-            </w:r>
-            <w:proofErr w:type="spellStart"/>
-            <w:r>
-              <w:t>sesión</w:t>
-            </w:r>
-            <w:proofErr w:type="spellEnd"/>
+            <w:r>
+              <w:t>Iniciar sesión</w:t>
+            </w:r>
           </w:p>
         </w:tc>
         <w:tc>
@@ -757,15 +615,7 @@
             <w:tcW w:w="3120" w:type="dxa"/>
           </w:tcPr>
           <w:p>
-            <w:pPr>
-              <w:rPr>
-                <w:lang w:val="es-CO"/>
-              </w:rPr>
-            </w:pPr>
-            <w:r>
-              <w:rPr>
-                <w:lang w:val="es-CO"/>
-              </w:rPr>
+            <w:r>
               <w:t>Gestionar estudiantes (crear, editar, eliminar, buscar)</w:t>
             </w:r>
           </w:p>
@@ -775,11 +625,9 @@
             <w:tcW w:w="3120" w:type="dxa"/>
           </w:tcPr>
           <w:p>
-            <w:proofErr w:type="spellStart"/>
             <w:r>
               <w:t>Administrador</w:t>
             </w:r>
-            <w:proofErr w:type="spellEnd"/>
           </w:p>
         </w:tc>
       </w:tr>
@@ -799,31 +647,19 @@
             <w:tcW w:w="3120" w:type="dxa"/>
           </w:tcPr>
           <w:p>
-            <w:proofErr w:type="spellStart"/>
-            <w:r>
-              <w:t>Gestionar</w:t>
-            </w:r>
-            <w:proofErr w:type="spellEnd"/>
-            <w:r>
-              <w:t xml:space="preserve"> </w:t>
-            </w:r>
-            <w:proofErr w:type="spellStart"/>
-            <w:r>
-              <w:t>cursos</w:t>
-            </w:r>
-            <w:proofErr w:type="spellEnd"/>
-          </w:p>
-        </w:tc>
-        <w:tc>
-          <w:tcPr>
-            <w:tcW w:w="3120" w:type="dxa"/>
-          </w:tcPr>
-          <w:p>
-            <w:proofErr w:type="spellStart"/>
+            <w:r>
+              <w:t>Gestionar cursos</w:t>
+            </w:r>
+          </w:p>
+        </w:tc>
+        <w:tc>
+          <w:tcPr>
+            <w:tcW w:w="3120" w:type="dxa"/>
+          </w:tcPr>
+          <w:p>
             <w:r>
               <w:t>Administrador</w:t>
             </w:r>
-            <w:proofErr w:type="spellEnd"/>
           </w:p>
         </w:tc>
       </w:tr>
@@ -843,15 +679,7 @@
             <w:tcW w:w="3120" w:type="dxa"/>
           </w:tcPr>
           <w:p>
-            <w:pPr>
-              <w:rPr>
-                <w:lang w:val="es-CO"/>
-              </w:rPr>
-            </w:pPr>
-            <w:r>
-              <w:rPr>
-                <w:lang w:val="es-CO"/>
-              </w:rPr>
+            <w:r>
               <w:t>Matricular estudiante en un curso</w:t>
             </w:r>
           </w:p>
@@ -861,11 +689,9 @@
             <w:tcW w:w="3120" w:type="dxa"/>
           </w:tcPr>
           <w:p>
-            <w:proofErr w:type="spellStart"/>
             <w:r>
               <w:t>Administrador</w:t>
             </w:r>
-            <w:proofErr w:type="spellEnd"/>
           </w:p>
         </w:tc>
       </w:tr>
@@ -886,25 +712,18 @@
           </w:tcPr>
           <w:p>
             <w:r>
-              <w:t xml:space="preserve">Registrar </w:t>
-            </w:r>
-            <w:proofErr w:type="spellStart"/>
-            <w:r>
-              <w:t>calificaciones</w:t>
-            </w:r>
-            <w:proofErr w:type="spellEnd"/>
-          </w:p>
-        </w:tc>
-        <w:tc>
-          <w:tcPr>
-            <w:tcW w:w="3120" w:type="dxa"/>
-          </w:tcPr>
-          <w:p>
-            <w:proofErr w:type="spellStart"/>
+              <w:t>Registrar calificaciones</w:t>
+            </w:r>
+          </w:p>
+        </w:tc>
+        <w:tc>
+          <w:tcPr>
+            <w:tcW w:w="3120" w:type="dxa"/>
+          </w:tcPr>
+          <w:p>
             <w:r>
               <w:t>Docente</w:t>
             </w:r>
-            <w:proofErr w:type="spellEnd"/>
           </w:p>
         </w:tc>
       </w:tr>
@@ -924,15 +743,7 @@
             <w:tcW w:w="3120" w:type="dxa"/>
           </w:tcPr>
           <w:p>
-            <w:pPr>
-              <w:rPr>
-                <w:lang w:val="es-CO"/>
-              </w:rPr>
-            </w:pPr>
-            <w:r>
-              <w:rPr>
-                <w:lang w:val="es-CO"/>
-              </w:rPr>
+            <w:r>
               <w:t>Consultar lista de estudiantes de un curso</w:t>
             </w:r>
           </w:p>
@@ -942,11 +753,9 @@
             <w:tcW w:w="3120" w:type="dxa"/>
           </w:tcPr>
           <w:p>
-            <w:proofErr w:type="spellStart"/>
             <w:r>
               <w:t>Docente</w:t>
             </w:r>
-            <w:proofErr w:type="spellEnd"/>
           </w:p>
         </w:tc>
       </w:tr>
@@ -966,39 +775,19 @@
             <w:tcW w:w="3120" w:type="dxa"/>
           </w:tcPr>
           <w:p>
-            <w:proofErr w:type="spellStart"/>
-            <w:r>
-              <w:t>Consultar</w:t>
-            </w:r>
-            <w:proofErr w:type="spellEnd"/>
-            <w:r>
-              <w:t xml:space="preserve"> </w:t>
-            </w:r>
-            <w:proofErr w:type="spellStart"/>
-            <w:r>
-              <w:t>calificaciones</w:t>
-            </w:r>
-            <w:proofErr w:type="spellEnd"/>
-            <w:r>
-              <w:t xml:space="preserve"> </w:t>
-            </w:r>
-            <w:proofErr w:type="spellStart"/>
-            <w:r>
-              <w:t>propias</w:t>
-            </w:r>
-            <w:proofErr w:type="spellEnd"/>
-          </w:p>
-        </w:tc>
-        <w:tc>
-          <w:tcPr>
-            <w:tcW w:w="3120" w:type="dxa"/>
-          </w:tcPr>
-          <w:p>
-            <w:proofErr w:type="spellStart"/>
+            <w:r>
+              <w:t>Consultar calificaciones propias</w:t>
+            </w:r>
+          </w:p>
+        </w:tc>
+        <w:tc>
+          <w:tcPr>
+            <w:tcW w:w="3120" w:type="dxa"/>
+          </w:tcPr>
+          <w:p>
             <w:r>
               <w:t>Estudiante</w:t>
             </w:r>
-            <w:proofErr w:type="spellEnd"/>
           </w:p>
         </w:tc>
       </w:tr>
@@ -1018,15 +807,7 @@
             <w:tcW w:w="3120" w:type="dxa"/>
           </w:tcPr>
           <w:p>
-            <w:pPr>
-              <w:rPr>
-                <w:lang w:val="es-CO"/>
-              </w:rPr>
-            </w:pPr>
-            <w:r>
-              <w:rPr>
-                <w:lang w:val="es-CO"/>
-              </w:rPr>
+            <w:r>
               <w:t>Generar reporte / boletín de notas</w:t>
             </w:r>
           </w:p>
@@ -1036,19 +817,9 @@
             <w:tcW w:w="3120" w:type="dxa"/>
           </w:tcPr>
           <w:p>
-            <w:proofErr w:type="spellStart"/>
-            <w:r>
-              <w:t>Administrador</w:t>
-            </w:r>
-            <w:proofErr w:type="spellEnd"/>
-            <w:r>
-              <w:t xml:space="preserve">, </w:t>
-            </w:r>
-            <w:proofErr w:type="spellStart"/>
-            <w:r>
-              <w:t>Docente</w:t>
-            </w:r>
-            <w:proofErr w:type="spellEnd"/>
+            <w:r>
+              <w:t>Administrador, Docente</w:t>
+            </w:r>
           </w:p>
         </w:tc>
       </w:tr>
@@ -1058,164 +829,86 @@
         <w:pStyle w:val="Ttulo3"/>
       </w:pPr>
       <w:r>
-        <w:t xml:space="preserve">2.3 </w:t>
-      </w:r>
-      <w:proofErr w:type="spellStart"/>
-      <w:r>
-        <w:t>Descripción</w:t>
-      </w:r>
-      <w:proofErr w:type="spellEnd"/>
-      <w:r>
-        <w:t xml:space="preserve"> de </w:t>
-      </w:r>
-      <w:proofErr w:type="spellStart"/>
-      <w:r>
-        <w:t>funcionalidades</w:t>
-      </w:r>
-      <w:proofErr w:type="spellEnd"/>
-    </w:p>
-    <w:p>
-      <w:pPr>
-        <w:rPr>
-          <w:lang w:val="es-CO"/>
-        </w:rPr>
-      </w:pPr>
+        <w:lastRenderedPageBreak/>
+        <w:t>2.3 Descripción de funcionalidades</w:t>
+      </w:r>
+    </w:p>
+    <w:p>
       <w:r>
         <w:rPr>
           <w:b/>
-          <w:lang w:val="es-CO"/>
         </w:rPr>
         <w:t>CU-01 Iniciar sesión.</w:t>
       </w:r>
       <w:r>
-        <w:rPr>
-          <w:lang w:val="es-CO"/>
-        </w:rPr>
         <w:t xml:space="preserve"> El usuario ingresa su identificador y contraseña. El sistema valida las credenciales y muestra las opciones según el rol. Si son incorrectas, muestra un mensaje de error y no permite el acceso.</w:t>
       </w:r>
     </w:p>
     <w:p>
-      <w:pPr>
-        <w:rPr>
-          <w:lang w:val="es-CO"/>
-        </w:rPr>
-      </w:pPr>
       <w:r>
         <w:rPr>
           <w:b/>
-          <w:lang w:val="es-CO"/>
         </w:rPr>
         <w:t>CU-02 Gestionar estudiantes.</w:t>
       </w:r>
       <w:r>
-        <w:rPr>
-          <w:lang w:val="es-CO"/>
-        </w:rPr>
         <w:t xml:space="preserve"> El administrador puede registrar un estudiante con sus datos (documento, nombres, apellidos, correo, fecha de nacimiento), modificarlos, buscarlos por nombre o documento y darlos de baja. No se permiten dos estudiantes con el mismo documento.</w:t>
       </w:r>
     </w:p>
     <w:p>
-      <w:pPr>
-        <w:rPr>
-          <w:lang w:val="es-CO"/>
-        </w:rPr>
-      </w:pPr>
       <w:r>
         <w:rPr>
           <w:b/>
-          <w:lang w:val="es-CO"/>
         </w:rPr>
         <w:t>CU-03 Gestionar cursos.</w:t>
       </w:r>
       <w:r>
-        <w:rPr>
-          <w:lang w:val="es-CO"/>
-        </w:rPr>
         <w:t xml:space="preserve"> El administrador crea cursos (código, nombre, créditos), les asigna un docente y puede editarlos o desactivarlos.</w:t>
       </w:r>
     </w:p>
     <w:p>
-      <w:pPr>
-        <w:rPr>
-          <w:lang w:val="es-CO"/>
-        </w:rPr>
-      </w:pPr>
       <w:r>
         <w:rPr>
           <w:b/>
-          <w:lang w:val="es-CO"/>
         </w:rPr>
         <w:t>CU-04 Matricular estudiante.</w:t>
       </w:r>
       <w:r>
-        <w:rPr>
-          <w:lang w:val="es-CO"/>
-        </w:rPr>
         <w:t xml:space="preserve"> El administrador selecciona un estudiante y un curso. El sistema verifica que el estudiante no esté ya matriculado en ese curso y crea la matrícula.</w:t>
       </w:r>
     </w:p>
     <w:p>
-      <w:pPr>
-        <w:rPr>
-          <w:lang w:val="es-CO"/>
-        </w:rPr>
-      </w:pPr>
       <w:r>
         <w:rPr>
           <w:b/>
-          <w:lang w:val="es-CO"/>
         </w:rPr>
         <w:t>CU-05 Registrar calificaciones.</w:t>
       </w:r>
       <w:r>
-        <w:rPr>
-          <w:lang w:val="es-CO"/>
-        </w:rPr>
         <w:t xml:space="preserve"> El docente elige uno de sus cursos, ve la lista de matriculados e ingresa una nota (entre 0.0 y 5.0). El sistema guarda la nota asociada a la matrícula.</w:t>
       </w:r>
     </w:p>
     <w:p>
-      <w:pPr>
-        <w:rPr>
-          <w:lang w:val="es-CO"/>
-        </w:rPr>
-      </w:pPr>
       <w:r>
         <w:rPr>
           <w:b/>
-          <w:lang w:val="es-CO"/>
         </w:rPr>
         <w:t>CU-07 Consultar calificaciones.</w:t>
       </w:r>
       <w:r>
-        <w:rPr>
-          <w:lang w:val="es-CO"/>
-        </w:rPr>
         <w:t xml:space="preserve"> El estudiante ve sus cursos con las notas registradas y su promedio.</w:t>
       </w:r>
     </w:p>
+    <w:p/>
     <w:p>
       <w:pPr>
         <w:pStyle w:val="Ttulo3"/>
       </w:pPr>
       <w:r>
-        <w:lastRenderedPageBreak/>
-        <w:t xml:space="preserve">2.4 </w:t>
-      </w:r>
-      <w:proofErr w:type="spellStart"/>
-      <w:r>
-        <w:t>Requerimientos</w:t>
-      </w:r>
-      <w:proofErr w:type="spellEnd"/>
-      <w:r>
-        <w:t xml:space="preserve"> </w:t>
-      </w:r>
-      <w:proofErr w:type="spellStart"/>
-      <w:r>
-        <w:t>funcionales</w:t>
-      </w:r>
-      <w:proofErr w:type="spellEnd"/>
-    </w:p>
+        <w:t>2.4 Requerimientos funcionales</w:t>
+      </w:r>
+    </w:p>
+    <w:p/>
     <w:tbl>
       <w:tblPr>
         <w:tblStyle w:val="Tablaconcuadrcula"/>
@@ -1248,11 +941,127 @@
             <w:shd w:val="clear" w:color="auto" w:fill="F2F2F2"/>
           </w:tcPr>
           <w:p>
+            <w:r>
+              <w:t>Requerimiento</w:t>
+            </w:r>
+          </w:p>
+        </w:tc>
+      </w:tr>
+      <w:tr>
+        <w:tc>
+          <w:tcPr>
+            <w:tcW w:w="4680" w:type="dxa"/>
+          </w:tcPr>
+          <w:p>
+            <w:r>
+              <w:t>RF-01</w:t>
+            </w:r>
+          </w:p>
+        </w:tc>
+        <w:tc>
+          <w:tcPr>
+            <w:tcW w:w="4680" w:type="dxa"/>
+          </w:tcPr>
+          <w:p>
+            <w:r>
+              <w:t>El sistema debe permitir iniciar y cerrar sesión con usuario y contraseña.</w:t>
+            </w:r>
+          </w:p>
+        </w:tc>
+      </w:tr>
+      <w:tr>
+        <w:tc>
+          <w:tcPr>
+            <w:tcW w:w="4680" w:type="dxa"/>
+          </w:tcPr>
+          <w:p>
+            <w:r>
+              <w:t>RF-02</w:t>
+            </w:r>
+          </w:p>
+        </w:tc>
+        <w:tc>
+          <w:tcPr>
+            <w:tcW w:w="4680" w:type="dxa"/>
+          </w:tcPr>
+          <w:p>
+            <w:r>
+              <w:t>El sistema debe restringir las funciones según el rol del usuario.</w:t>
+            </w:r>
+          </w:p>
+        </w:tc>
+      </w:tr>
+      <w:tr>
+        <w:tc>
+          <w:tcPr>
+            <w:tcW w:w="4680" w:type="dxa"/>
+          </w:tcPr>
+          <w:p>
+            <w:r>
+              <w:t>RF-03</w:t>
+            </w:r>
+          </w:p>
+        </w:tc>
+        <w:tc>
+          <w:tcPr>
+            <w:tcW w:w="4680" w:type="dxa"/>
+          </w:tcPr>
+          <w:p>
+            <w:r>
+              <w:t>El sistema debe permitir crear, consultar, modificar y eliminar estudiantes.</w:t>
+            </w:r>
+          </w:p>
+        </w:tc>
+      </w:tr>
+      <w:tr>
+        <w:tc>
+          <w:tcPr>
+            <w:tcW w:w="4680" w:type="dxa"/>
+          </w:tcPr>
+          <w:p>
+            <w:r>
+              <w:t>RF-04</w:t>
+            </w:r>
+          </w:p>
+        </w:tc>
+        <w:tc>
+          <w:tcPr>
+            <w:tcW w:w="4680" w:type="dxa"/>
+          </w:tcPr>
+          <w:p>
+            <w:r>
+              <w:t>El sistema debe permitir crear, consultar, modificar y desactivar cursos.</w:t>
+            </w:r>
+          </w:p>
+        </w:tc>
+      </w:tr>
+      <w:tr>
+        <w:tc>
+          <w:tcPr>
+            <w:tcW w:w="4680" w:type="dxa"/>
+          </w:tcPr>
+          <w:p>
+            <w:r>
+              <w:t>RF-05</w:t>
+            </w:r>
+          </w:p>
+        </w:tc>
+        <w:tc>
+          <w:tcPr>
+            <w:tcW w:w="4680" w:type="dxa"/>
+          </w:tcPr>
+          <w:p>
+            <w:r>
+              <w:t xml:space="preserve">El sistema debe permitir matricular y </w:t>
+            </w:r>
             <w:proofErr w:type="spellStart"/>
             <w:r>
-              <w:t>Requerimiento</w:t>
+              <w:t>desmatricular</w:t>
             </w:r>
             <w:proofErr w:type="spellEnd"/>
+            <w:r>
+              <w:t xml:space="preserve"> estudiantes en cursos.</w:t>
+            </w:r>
           </w:p>
         </w:tc>
       </w:tr>
@@ -1263,7 +1072,7 @@
           </w:tcPr>
           <w:p>
             <w:r>
-              <w:t>RF-01</w:t>
+              <w:t>RF-06</w:t>
             </w:r>
           </w:p>
         </w:tc>
@@ -1272,16 +1081,8 @@
             <w:tcW w:w="4680" w:type="dxa"/>
           </w:tcPr>
           <w:p>
-            <w:pPr>
-              <w:rPr>
-                <w:lang w:val="es-CO"/>
-              </w:rPr>
-            </w:pPr>
-            <w:r>
-              <w:rPr>
-                <w:lang w:val="es-CO"/>
-              </w:rPr>
-              <w:t>El sistema debe permitir iniciar y cerrar sesión con usuario y contraseña.</w:t>
+            <w:r>
+              <w:t>El sistema debe permitir al docente registrar y modificar notas de sus cursos.</w:t>
             </w:r>
           </w:p>
         </w:tc>
@@ -1293,7 +1094,7 @@
           </w:tcPr>
           <w:p>
             <w:r>
-              <w:t>RF-02</w:t>
+              <w:t>RF-07</w:t>
             </w:r>
           </w:p>
         </w:tc>
@@ -1302,16 +1103,8 @@
             <w:tcW w:w="4680" w:type="dxa"/>
           </w:tcPr>
           <w:p>
-            <w:pPr>
-              <w:rPr>
-                <w:lang w:val="es-CO"/>
-              </w:rPr>
-            </w:pPr>
-            <w:r>
-              <w:rPr>
-                <w:lang w:val="es-CO"/>
-              </w:rPr>
-              <w:t>El sistema debe restringir las funciones según el rol del usuario.</w:t>
+            <w:r>
+              <w:t>El sistema debe permitir al estudiante consultar sus notas y su promedio.</w:t>
             </w:r>
           </w:p>
         </w:tc>
@@ -1323,7 +1116,8 @@
           </w:tcPr>
           <w:p>
             <w:r>
-              <w:t>RF-03</w:t>
+              <w:lastRenderedPageBreak/>
+              <w:t>RF-08</w:t>
             </w:r>
           </w:p>
         </w:tc>
@@ -1332,16 +1126,8 @@
             <w:tcW w:w="4680" w:type="dxa"/>
           </w:tcPr>
           <w:p>
-            <w:pPr>
-              <w:rPr>
-                <w:lang w:val="es-CO"/>
-              </w:rPr>
-            </w:pPr>
-            <w:r>
-              <w:rPr>
-                <w:lang w:val="es-CO"/>
-              </w:rPr>
-              <w:t>El sistema debe permitir crear, consultar, modificar y eliminar estudiantes.</w:t>
+            <w:r>
+              <w:t>El sistema debe generar un reporte de estudiantes por curso y un boletín de notas.</w:t>
             </w:r>
           </w:p>
         </w:tc>
@@ -1353,7 +1139,7 @@
           </w:tcPr>
           <w:p>
             <w:r>
-              <w:t>RF-04</w:t>
+              <w:t>RF-09</w:t>
             </w:r>
           </w:p>
         </w:tc>
@@ -1362,179 +1148,7 @@
             <w:tcW w:w="4680" w:type="dxa"/>
           </w:tcPr>
           <w:p>
-            <w:pPr>
-              <w:rPr>
-                <w:lang w:val="es-CO"/>
-              </w:rPr>
-            </w:pPr>
-            <w:r>
-              <w:rPr>
-                <w:lang w:val="es-CO"/>
-              </w:rPr>
-              <w:t>El sistema debe permitir crear, consultar, modificar y desactivar cursos.</w:t>
-            </w:r>
-          </w:p>
-        </w:tc>
-      </w:tr>
-      <w:tr>
-        <w:tc>
-          <w:tcPr>
-            <w:tcW w:w="4680" w:type="dxa"/>
-          </w:tcPr>
-          <w:p>
-            <w:r>
-              <w:t>RF-05</w:t>
-            </w:r>
-          </w:p>
-        </w:tc>
-        <w:tc>
-          <w:tcPr>
-            <w:tcW w:w="4680" w:type="dxa"/>
-          </w:tcPr>
-          <w:p>
-            <w:pPr>
-              <w:rPr>
-                <w:lang w:val="es-CO"/>
-              </w:rPr>
-            </w:pPr>
-            <w:r>
-              <w:rPr>
-                <w:lang w:val="es-CO"/>
-              </w:rPr>
-              <w:t xml:space="preserve">El sistema debe permitir matricular y </w:t>
-            </w:r>
-            <w:proofErr w:type="spellStart"/>
-            <w:r>
-              <w:rPr>
-                <w:lang w:val="es-CO"/>
-              </w:rPr>
-              <w:t>desmatricular</w:t>
-            </w:r>
-            <w:proofErr w:type="spellEnd"/>
-            <w:r>
-              <w:rPr>
-                <w:lang w:val="es-CO"/>
-              </w:rPr>
-              <w:t xml:space="preserve"> estudiantes en cursos.</w:t>
-            </w:r>
-          </w:p>
-        </w:tc>
-      </w:tr>
-      <w:tr>
-        <w:tc>
-          <w:tcPr>
-            <w:tcW w:w="4680" w:type="dxa"/>
-          </w:tcPr>
-          <w:p>
-            <w:r>
-              <w:t>RF-06</w:t>
-            </w:r>
-          </w:p>
-        </w:tc>
-        <w:tc>
-          <w:tcPr>
-            <w:tcW w:w="4680" w:type="dxa"/>
-          </w:tcPr>
-          <w:p>
-            <w:pPr>
-              <w:rPr>
-                <w:lang w:val="es-CO"/>
-              </w:rPr>
-            </w:pPr>
-            <w:r>
-              <w:rPr>
-                <w:lang w:val="es-CO"/>
-              </w:rPr>
-              <w:t>El sistema debe permitir al docente registrar y modificar notas de sus cursos.</w:t>
-            </w:r>
-          </w:p>
-        </w:tc>
-      </w:tr>
-      <w:tr>
-        <w:tc>
-          <w:tcPr>
-            <w:tcW w:w="4680" w:type="dxa"/>
-          </w:tcPr>
-          <w:p>
-            <w:r>
-              <w:t>RF-07</w:t>
-            </w:r>
-          </w:p>
-        </w:tc>
-        <w:tc>
-          <w:tcPr>
-            <w:tcW w:w="4680" w:type="dxa"/>
-          </w:tcPr>
-          <w:p>
-            <w:pPr>
-              <w:rPr>
-                <w:lang w:val="es-CO"/>
-              </w:rPr>
-            </w:pPr>
-            <w:r>
-              <w:rPr>
-                <w:lang w:val="es-CO"/>
-              </w:rPr>
-              <w:t>El sistema debe permitir al estudiante consultar sus notas y su promedio.</w:t>
-            </w:r>
-          </w:p>
-        </w:tc>
-      </w:tr>
-      <w:tr>
-        <w:tc>
-          <w:tcPr>
-            <w:tcW w:w="4680" w:type="dxa"/>
-          </w:tcPr>
-          <w:p>
-            <w:r>
-              <w:t>RF-08</w:t>
-            </w:r>
-          </w:p>
-        </w:tc>
-        <w:tc>
-          <w:tcPr>
-            <w:tcW w:w="4680" w:type="dxa"/>
-          </w:tcPr>
-          <w:p>
-            <w:pPr>
-              <w:rPr>
-                <w:lang w:val="es-CO"/>
-              </w:rPr>
-            </w:pPr>
-            <w:r>
-              <w:rPr>
-                <w:lang w:val="es-CO"/>
-              </w:rPr>
-              <w:t>El sistema debe generar un reporte de estudiantes por curso y un boletín de notas.</w:t>
-            </w:r>
-          </w:p>
-        </w:tc>
-      </w:tr>
-      <w:tr>
-        <w:tc>
-          <w:tcPr>
-            <w:tcW w:w="4680" w:type="dxa"/>
-          </w:tcPr>
-          <w:p>
-            <w:r>
-              <w:t>RF-09</w:t>
-            </w:r>
-          </w:p>
-        </w:tc>
-        <w:tc>
-          <w:tcPr>
-            <w:tcW w:w="4680" w:type="dxa"/>
-          </w:tcPr>
-          <w:p>
-            <w:pPr>
-              <w:rPr>
-                <w:lang w:val="es-CO"/>
-              </w:rPr>
-            </w:pPr>
-            <w:r>
-              <w:rPr>
-                <w:lang w:val="es-CO"/>
-              </w:rPr>
+            <w:r>
               <w:t>El sistema debe permitir buscar estudiantes por nombre o documento.</w:t>
             </w:r>
           </w:p>
@@ -1545,23 +1159,16 @@
       <w:pPr>
         <w:pStyle w:val="Ttulo3"/>
       </w:pPr>
-      <w:r>
-        <w:t xml:space="preserve">2.5 </w:t>
-      </w:r>
-      <w:proofErr w:type="spellStart"/>
-      <w:r>
-        <w:t>Requerimientos</w:t>
-      </w:r>
-      <w:proofErr w:type="spellEnd"/>
-      <w:r>
-        <w:t xml:space="preserve"> no </w:t>
-      </w:r>
-      <w:proofErr w:type="spellStart"/>
-      <w:r>
-        <w:t>funcionales</w:t>
-      </w:r>
-      <w:proofErr w:type="spellEnd"/>
-    </w:p>
+    </w:p>
+    <w:p>
+      <w:pPr>
+        <w:pStyle w:val="Ttulo3"/>
+      </w:pPr>
+      <w:r>
+        <w:t>2.5 Requerimientos no funcionales</w:t>
+      </w:r>
+    </w:p>
+    <w:p/>
     <w:tbl>
       <w:tblPr>
         <w:tblStyle w:val="Tablaconcuadrcula"/>
@@ -1595,11 +1202,9 @@
             <w:shd w:val="clear" w:color="auto" w:fill="F2F2F2"/>
           </w:tcPr>
           <w:p>
-            <w:proofErr w:type="spellStart"/>
             <w:r>
               <w:t>Categoría</w:t>
             </w:r>
-            <w:proofErr w:type="spellEnd"/>
           </w:p>
         </w:tc>
         <w:tc>
@@ -1608,11 +1213,9 @@
             <w:shd w:val="clear" w:color="auto" w:fill="F2F2F2"/>
           </w:tcPr>
           <w:p>
-            <w:proofErr w:type="spellStart"/>
             <w:r>
               <w:t>Requerimiento</w:t>
             </w:r>
-            <w:proofErr w:type="spellEnd"/>
           </w:p>
         </w:tc>
       </w:tr>
@@ -1632,27 +1235,17 @@
             <w:tcW w:w="3120" w:type="dxa"/>
           </w:tcPr>
           <w:p>
-            <w:proofErr w:type="spellStart"/>
             <w:r>
               <w:t>Seguridad</w:t>
             </w:r>
-            <w:proofErr w:type="spellEnd"/>
-          </w:p>
-        </w:tc>
-        <w:tc>
-          <w:tcPr>
-            <w:tcW w:w="3120" w:type="dxa"/>
-          </w:tcPr>
-          <w:p>
-            <w:pPr>
-              <w:rPr>
-                <w:lang w:val="es-CO"/>
-              </w:rPr>
-            </w:pPr>
-            <w:r>
-              <w:rPr>
-                <w:lang w:val="es-CO"/>
-              </w:rPr>
+          </w:p>
+        </w:tc>
+        <w:tc>
+          <w:tcPr>
+            <w:tcW w:w="3120" w:type="dxa"/>
+          </w:tcPr>
+          <w:p>
+            <w:r>
               <w:t>Las contraseñas deben almacenarse cifradas (hash), nunca en texto plano.</w:t>
             </w:r>
           </w:p>
@@ -1674,27 +1267,17 @@
             <w:tcW w:w="3120" w:type="dxa"/>
           </w:tcPr>
           <w:p>
-            <w:proofErr w:type="spellStart"/>
             <w:r>
               <w:t>Usabilidad</w:t>
             </w:r>
-            <w:proofErr w:type="spellEnd"/>
-          </w:p>
-        </w:tc>
-        <w:tc>
-          <w:tcPr>
-            <w:tcW w:w="3120" w:type="dxa"/>
-          </w:tcPr>
-          <w:p>
-            <w:pPr>
-              <w:rPr>
-                <w:lang w:val="es-CO"/>
-              </w:rPr>
-            </w:pPr>
-            <w:r>
-              <w:rPr>
-                <w:lang w:val="es-CO"/>
-              </w:rPr>
+          </w:p>
+        </w:tc>
+        <w:tc>
+          <w:tcPr>
+            <w:tcW w:w="3120" w:type="dxa"/>
+          </w:tcPr>
+          <w:p>
+            <w:r>
               <w:t>La interfaz debe ser clara y usable sin capacitación extensa.</w:t>
             </w:r>
           </w:p>
@@ -1716,27 +1299,17 @@
             <w:tcW w:w="3120" w:type="dxa"/>
           </w:tcPr>
           <w:p>
-            <w:proofErr w:type="spellStart"/>
             <w:r>
               <w:t>Rendimiento</w:t>
             </w:r>
-            <w:proofErr w:type="spellEnd"/>
-          </w:p>
-        </w:tc>
-        <w:tc>
-          <w:tcPr>
-            <w:tcW w:w="3120" w:type="dxa"/>
-          </w:tcPr>
-          <w:p>
-            <w:pPr>
-              <w:rPr>
-                <w:lang w:val="es-CO"/>
-              </w:rPr>
-            </w:pPr>
-            <w:r>
-              <w:rPr>
-                <w:lang w:val="es-CO"/>
-              </w:rPr>
+          </w:p>
+        </w:tc>
+        <w:tc>
+          <w:tcPr>
+            <w:tcW w:w="3120" w:type="dxa"/>
+          </w:tcPr>
+          <w:p>
+            <w:r>
               <w:t>Las consultas comunes deben responder en menos de 3 segundos.</w:t>
             </w:r>
           </w:p>
@@ -1758,27 +1331,17 @@
             <w:tcW w:w="3120" w:type="dxa"/>
           </w:tcPr>
           <w:p>
-            <w:proofErr w:type="spellStart"/>
             <w:r>
               <w:t>Disponibilidad</w:t>
             </w:r>
-            <w:proofErr w:type="spellEnd"/>
-          </w:p>
-        </w:tc>
-        <w:tc>
-          <w:tcPr>
-            <w:tcW w:w="3120" w:type="dxa"/>
-          </w:tcPr>
-          <w:p>
-            <w:pPr>
-              <w:rPr>
-                <w:lang w:val="es-CO"/>
-              </w:rPr>
-            </w:pPr>
-            <w:r>
-              <w:rPr>
-                <w:lang w:val="es-CO"/>
-              </w:rPr>
+          </w:p>
+        </w:tc>
+        <w:tc>
+          <w:tcPr>
+            <w:tcW w:w="3120" w:type="dxa"/>
+          </w:tcPr>
+          <w:p>
+            <w:r>
               <w:t>El sistema debe estar disponible en horario académico.</w:t>
             </w:r>
           </w:p>
@@ -1800,47 +1363,29 @@
             <w:tcW w:w="3120" w:type="dxa"/>
           </w:tcPr>
           <w:p>
-            <w:proofErr w:type="spellStart"/>
             <w:r>
               <w:t>Mantenibilidad</w:t>
             </w:r>
-            <w:proofErr w:type="spellEnd"/>
-          </w:p>
-        </w:tc>
-        <w:tc>
-          <w:tcPr>
-            <w:tcW w:w="3120" w:type="dxa"/>
-          </w:tcPr>
-          <w:p>
-            <w:pPr>
-              <w:rPr>
-                <w:lang w:val="es-CO"/>
-              </w:rPr>
-            </w:pPr>
-            <w:r>
-              <w:rPr>
-                <w:lang w:val="es-CO"/>
-              </w:rPr>
-              <w:t xml:space="preserve">El código debe estar organizado por capas y documentado para </w:t>
-            </w:r>
-            <w:r>
-              <w:rPr>
-                <w:lang w:val="es-CO"/>
-              </w:rPr>
-              <w:lastRenderedPageBreak/>
-              <w:t>facilitar cambios.</w:t>
-            </w:r>
-          </w:p>
-        </w:tc>
-      </w:tr>
-      <w:tr>
-        <w:tc>
-          <w:tcPr>
-            <w:tcW w:w="3120" w:type="dxa"/>
-          </w:tcPr>
-          <w:p>
-            <w:r>
-              <w:lastRenderedPageBreak/>
+          </w:p>
+        </w:tc>
+        <w:tc>
+          <w:tcPr>
+            <w:tcW w:w="3120" w:type="dxa"/>
+          </w:tcPr>
+          <w:p>
+            <w:r>
+              <w:t>El código debe estar organizado por capas y documentado para facilitar cambios.</w:t>
+            </w:r>
+          </w:p>
+        </w:tc>
+      </w:tr>
+      <w:tr>
+        <w:tc>
+          <w:tcPr>
+            <w:tcW w:w="3120" w:type="dxa"/>
+          </w:tcPr>
+          <w:p>
+            <w:r>
               <w:t>RNF-06</w:t>
             </w:r>
           </w:p>
@@ -1850,27 +1395,17 @@
             <w:tcW w:w="3120" w:type="dxa"/>
           </w:tcPr>
           <w:p>
-            <w:proofErr w:type="spellStart"/>
             <w:r>
               <w:t>Portabilidad</w:t>
             </w:r>
-            <w:proofErr w:type="spellEnd"/>
-          </w:p>
-        </w:tc>
-        <w:tc>
-          <w:tcPr>
-            <w:tcW w:w="3120" w:type="dxa"/>
-          </w:tcPr>
-          <w:p>
-            <w:pPr>
-              <w:rPr>
-                <w:lang w:val="es-CO"/>
-              </w:rPr>
-            </w:pPr>
-            <w:r>
-              <w:rPr>
-                <w:lang w:val="es-CO"/>
-              </w:rPr>
+          </w:p>
+        </w:tc>
+        <w:tc>
+          <w:tcPr>
+            <w:tcW w:w="3120" w:type="dxa"/>
+          </w:tcPr>
+          <w:p>
+            <w:r>
               <w:t>El sistema debe funcionar en los navegadores modernos más usados.</w:t>
             </w:r>
           </w:p>
@@ -1892,27 +1427,17 @@
             <w:tcW w:w="3120" w:type="dxa"/>
           </w:tcPr>
           <w:p>
-            <w:proofErr w:type="spellStart"/>
             <w:r>
               <w:t>Integridad</w:t>
             </w:r>
-            <w:proofErr w:type="spellEnd"/>
-          </w:p>
-        </w:tc>
-        <w:tc>
-          <w:tcPr>
-            <w:tcW w:w="3120" w:type="dxa"/>
-          </w:tcPr>
-          <w:p>
-            <w:pPr>
-              <w:rPr>
-                <w:lang w:val="es-CO"/>
-              </w:rPr>
-            </w:pPr>
-            <w:r>
-              <w:rPr>
-                <w:lang w:val="es-CO"/>
-              </w:rPr>
+          </w:p>
+        </w:tc>
+        <w:tc>
+          <w:tcPr>
+            <w:tcW w:w="3120" w:type="dxa"/>
+          </w:tcPr>
+          <w:p>
+            <w:r>
               <w:t>Los datos deben validarse antes de guardarse (documento único, nota entre 0 y 5).</w:t>
             </w:r>
           </w:p>
@@ -1922,43 +1447,38 @@
     <w:p>
       <w:pPr>
         <w:pStyle w:val="Ttulo3"/>
-        <w:rPr>
-          <w:lang w:val="es-CO"/>
-        </w:rPr>
-      </w:pPr>
-      <w:r>
-        <w:rPr>
-          <w:lang w:val="es-CO"/>
-        </w:rPr>
+      </w:pPr>
+    </w:p>
+    <w:p>
+      <w:pPr>
+        <w:pStyle w:val="Ttulo3"/>
+      </w:pPr>
+    </w:p>
+    <w:p/>
+    <w:p>
+      <w:pPr>
+        <w:pStyle w:val="Ttulo3"/>
+      </w:pPr>
+      <w:r>
+        <w:lastRenderedPageBreak/>
         <w:t>2.6 Arquitectura del sistema</w:t>
       </w:r>
     </w:p>
     <w:p>
-      <w:pPr>
-        <w:rPr>
-          <w:lang w:val="es-CO"/>
-        </w:rPr>
-      </w:pPr>
-      <w:r>
-        <w:rPr>
-          <w:lang w:val="es-CO"/>
-        </w:rPr>
+      <w:r>
         <w:t xml:space="preserve">Se propone una </w:t>
       </w:r>
       <w:r>
         <w:rPr>
           <w:b/>
-          <w:lang w:val="es-CO"/>
         </w:rPr>
         <w:t>arquitectura en tres capas</w:t>
       </w:r>
       <w:r>
-        <w:rPr>
-          <w:lang w:val="es-CO"/>
-        </w:rPr>
         <w:t>, simple de implementar y fácil de ampliar:</w:t>
       </w:r>
     </w:p>
+    <w:p/>
     <w:tbl>
       <w:tblPr>
         <w:tblStyle w:val="Tablaconcuadrcula"/>
@@ -1992,11 +1512,9 @@
             <w:shd w:val="clear" w:color="auto" w:fill="F2F2F2"/>
           </w:tcPr>
           <w:p>
-            <w:proofErr w:type="spellStart"/>
             <w:r>
               <w:t>Responsabilidad</w:t>
             </w:r>
-            <w:proofErr w:type="spellEnd"/>
           </w:p>
         </w:tc>
         <w:tc>
@@ -2005,11 +1523,9 @@
             <w:shd w:val="clear" w:color="auto" w:fill="F2F2F2"/>
           </w:tcPr>
           <w:p>
-            <w:proofErr w:type="spellStart"/>
             <w:r>
               <w:t>Ejemplos</w:t>
             </w:r>
-            <w:proofErr w:type="spellEnd"/>
           </w:p>
         </w:tc>
       </w:tr>
@@ -2029,15 +1545,7 @@
             <w:tcW w:w="3120" w:type="dxa"/>
           </w:tcPr>
           <w:p>
-            <w:pPr>
-              <w:rPr>
-                <w:lang w:val="es-CO"/>
-              </w:rPr>
-            </w:pPr>
-            <w:r>
-              <w:rPr>
-                <w:lang w:val="es-CO"/>
-              </w:rPr>
+            <w:r>
               <w:t>Interfaz con la que interactúa el usuario.</w:t>
             </w:r>
           </w:p>
@@ -2047,60 +1555,29 @@
             <w:tcW w:w="3120" w:type="dxa"/>
           </w:tcPr>
           <w:p>
-            <w:proofErr w:type="spellStart"/>
-            <w:r>
-              <w:t>Pantallas</w:t>
-            </w:r>
-            <w:proofErr w:type="spellEnd"/>
-            <w:r>
-              <w:t xml:space="preserve"> web o </w:t>
-            </w:r>
-            <w:proofErr w:type="spellStart"/>
-            <w:r>
-              <w:t>consola</w:t>
-            </w:r>
-            <w:proofErr w:type="spellEnd"/>
-            <w:r>
-              <w:t>.</w:t>
-            </w:r>
-          </w:p>
-        </w:tc>
-      </w:tr>
-      <w:tr>
-        <w:tc>
-          <w:tcPr>
-            <w:tcW w:w="3120" w:type="dxa"/>
-          </w:tcPr>
-          <w:p>
-            <w:proofErr w:type="spellStart"/>
-            <w:r>
-              <w:t>Lógica</w:t>
-            </w:r>
-            <w:proofErr w:type="spellEnd"/>
-            <w:r>
-              <w:t xml:space="preserve"> de </w:t>
-            </w:r>
-            <w:proofErr w:type="spellStart"/>
-            <w:r>
-              <w:t>negocio</w:t>
-            </w:r>
-            <w:proofErr w:type="spellEnd"/>
-          </w:p>
-        </w:tc>
-        <w:tc>
-          <w:tcPr>
-            <w:tcW w:w="3120" w:type="dxa"/>
-          </w:tcPr>
-          <w:p>
-            <w:pPr>
-              <w:rPr>
-                <w:lang w:val="es-CO"/>
-              </w:rPr>
-            </w:pPr>
-            <w:r>
-              <w:rPr>
-                <w:lang w:val="es-CO"/>
-              </w:rPr>
+            <w:r>
+              <w:t>Pantallas web o consola.</w:t>
+            </w:r>
+          </w:p>
+        </w:tc>
+      </w:tr>
+      <w:tr>
+        <w:tc>
+          <w:tcPr>
+            <w:tcW w:w="3120" w:type="dxa"/>
+          </w:tcPr>
+          <w:p>
+            <w:r>
+              <w:t>Lógica de negocio</w:t>
+            </w:r>
+          </w:p>
+        </w:tc>
+        <w:tc>
+          <w:tcPr>
+            <w:tcW w:w="3120" w:type="dxa"/>
+          </w:tcPr>
+          <w:p>
+            <w:r>
               <w:t>Reglas del sistema: validaciones, matrículas, cálculo de promedios.</w:t>
             </w:r>
           </w:p>
@@ -2110,13 +1587,8 @@
             <w:tcW w:w="3120" w:type="dxa"/>
           </w:tcPr>
           <w:p>
-            <w:proofErr w:type="spellStart"/>
-            <w:r>
-              <w:t>Servicios</w:t>
-            </w:r>
-            <w:proofErr w:type="spellEnd"/>
-            <w:r>
-              <w:t xml:space="preserve"> </w:t>
+            <w:r>
+              <w:t xml:space="preserve">Servicios </w:t>
             </w:r>
             <w:proofErr w:type="spellStart"/>
             <w:r>
@@ -2149,35 +1621,17 @@
             <w:tcW w:w="3120" w:type="dxa"/>
           </w:tcPr>
           <w:p>
-            <w:proofErr w:type="spellStart"/>
-            <w:r>
-              <w:t>Acceso</w:t>
-            </w:r>
-            <w:proofErr w:type="spellEnd"/>
-            <w:r>
-              <w:t xml:space="preserve"> a </w:t>
-            </w:r>
-            <w:proofErr w:type="spellStart"/>
-            <w:r>
-              <w:t>datos</w:t>
-            </w:r>
-            <w:proofErr w:type="spellEnd"/>
-          </w:p>
-        </w:tc>
-        <w:tc>
-          <w:tcPr>
-            <w:tcW w:w="3120" w:type="dxa"/>
-          </w:tcPr>
-          <w:p>
-            <w:pPr>
-              <w:rPr>
-                <w:lang w:val="es-CO"/>
-              </w:rPr>
-            </w:pPr>
-            <w:r>
-              <w:rPr>
-                <w:lang w:val="es-CO"/>
-              </w:rPr>
+            <w:r>
+              <w:t>Acceso a datos</w:t>
+            </w:r>
+          </w:p>
+        </w:tc>
+        <w:tc>
+          <w:tcPr>
+            <w:tcW w:w="3120" w:type="dxa"/>
+          </w:tcPr>
+          <w:p>
+            <w:r>
               <w:t>Lectura y escritura en la base de datos.</w:t>
             </w:r>
           </w:p>
@@ -2187,15 +1641,7 @@
             <w:tcW w:w="3120" w:type="dxa"/>
           </w:tcPr>
           <w:p>
-            <w:pPr>
-              <w:rPr>
-                <w:lang w:val="es-CO"/>
-              </w:rPr>
-            </w:pPr>
-            <w:r>
-              <w:rPr>
-                <w:lang w:val="es-CO"/>
-              </w:rPr>
+            <w:r>
               <w:t>Repositorios y base de datos relacional (SQLite o MySQL).</w:t>
             </w:r>
           </w:p>
@@ -2206,21 +1652,27 @@
       <w:pPr>
         <w:pStyle w:val="Code"/>
         <w:jc w:val="center"/>
-        <w:rPr>
-          <w:lang w:val="es-CO"/>
-        </w:rPr>
       </w:pPr>
       <w:bookmarkStart w:id="0" w:name="bongo_lang_mermaid_1"/>
       <w:bookmarkEnd w:id="0"/>
-      <w:r>
-        <w:rPr>
-          <w:noProof/>
-          <w:lang w:val="es-CO"/>
-        </w:rPr>
+    </w:p>
+    <w:p>
+      <w:pPr>
+        <w:pStyle w:val="Code"/>
+      </w:pPr>
+      <w:r>
         <w:drawing>
-          <wp:inline distT="0" distB="0" distL="0" distR="0" wp14:anchorId="71F7E2B5" wp14:editId="09E534C2">
-            <wp:extent cx="1089660" cy="3674793"/>
+          <wp:anchor distT="0" distB="0" distL="114300" distR="114300" simplePos="0" relativeHeight="251665408" behindDoc="0" locked="0" layoutInCell="1" allowOverlap="1" wp14:anchorId="71F7E2B5" wp14:editId="390E4E5D">
+            <wp:simplePos x="0" y="0"/>
+            <wp:positionH relativeFrom="column">
+              <wp:posOffset>2257656</wp:posOffset>
+            </wp:positionH>
+            <wp:positionV relativeFrom="paragraph">
+              <wp:posOffset>6350</wp:posOffset>
+            </wp:positionV>
+            <wp:extent cx="1185776" cy="4001302"/>
             <wp:effectExtent l="0" t="0" r="0" b="0"/>
+            <wp:wrapNone/>
             <wp:docPr id="1150692213" name="Imagen 2"/>
             <wp:cNvGraphicFramePr>
               <a:graphicFrameLocks xmlns:a="http://schemas.openxmlformats.org/drawingml/2006/main" noChangeAspect="1"/>
@@ -2250,7 +1702,7 @@
                   <pic:spPr bwMode="auto">
                     <a:xfrm>
                       <a:off x="0" y="0"/>
-                      <a:ext cx="1100260" cy="3710540"/>
+                      <a:ext cx="1185776" cy="4001302"/>
                     </a:xfrm>
                     <a:prstGeom prst="rect">
                       <a:avLst/>
@@ -2263,163 +1715,259 @@
                 </pic:pic>
               </a:graphicData>
             </a:graphic>
-          </wp:inline>
+            <wp14:sizeRelH relativeFrom="margin">
+              <wp14:pctWidth>0</wp14:pctWidth>
+            </wp14:sizeRelH>
+            <wp14:sizeRelV relativeFrom="margin">
+              <wp14:pctHeight>0</wp14:pctHeight>
+            </wp14:sizeRelV>
+          </wp:anchor>
         </w:drawing>
       </w:r>
     </w:p>
     <w:p>
       <w:pPr>
         <w:pStyle w:val="Code"/>
-        <w:rPr>
-          <w:lang w:val="es-CO"/>
-        </w:rPr>
       </w:pPr>
     </w:p>
     <w:p>
       <w:pPr>
         <w:pStyle w:val="Code"/>
-        <w:rPr>
-          <w:lang w:val="es-CO"/>
-        </w:rPr>
-      </w:pPr>
-    </w:p>
-    <w:p>
-      <w:pPr>
-        <w:rPr>
-          <w:lang w:val="es-CO"/>
-        </w:rPr>
-      </w:pPr>
-      <w:r>
+      </w:pPr>
+    </w:p>
+    <w:p>
+      <w:pPr>
+        <w:pStyle w:val="Code"/>
+      </w:pPr>
+    </w:p>
+    <w:p>
+      <w:pPr>
+        <w:pStyle w:val="Code"/>
+      </w:pPr>
+    </w:p>
+    <w:p>
+      <w:pPr>
+        <w:pStyle w:val="Code"/>
+      </w:pPr>
+    </w:p>
+    <w:p>
+      <w:pPr>
+        <w:pStyle w:val="Code"/>
+      </w:pPr>
+    </w:p>
+    <w:p>
+      <w:pPr>
+        <w:pStyle w:val="Code"/>
+      </w:pPr>
+    </w:p>
+    <w:p>
+      <w:pPr>
+        <w:pStyle w:val="Code"/>
+      </w:pPr>
+    </w:p>
+    <w:p>
+      <w:pPr>
+        <w:pStyle w:val="Code"/>
+      </w:pPr>
+    </w:p>
+    <w:p>
+      <w:pPr>
+        <w:pStyle w:val="Code"/>
+      </w:pPr>
+    </w:p>
+    <w:p>
+      <w:pPr>
+        <w:pStyle w:val="Code"/>
+      </w:pPr>
+    </w:p>
+    <w:p>
+      <w:pPr>
+        <w:pStyle w:val="Code"/>
+      </w:pPr>
+    </w:p>
+    <w:p>
+      <w:pPr>
+        <w:pStyle w:val="Code"/>
+      </w:pPr>
+    </w:p>
+    <w:p>
+      <w:pPr>
+        <w:pStyle w:val="Code"/>
+      </w:pPr>
+    </w:p>
+    <w:p>
+      <w:pPr>
+        <w:pStyle w:val="Code"/>
+      </w:pPr>
+    </w:p>
+    <w:p>
+      <w:pPr>
+        <w:pStyle w:val="Code"/>
+      </w:pPr>
+    </w:p>
+    <w:p>
+      <w:pPr>
+        <w:pStyle w:val="Code"/>
+      </w:pPr>
+    </w:p>
+    <w:p>
+      <w:pPr>
+        <w:pStyle w:val="Code"/>
+      </w:pPr>
+    </w:p>
+    <w:p>
+      <w:pPr>
+        <w:pStyle w:val="Code"/>
+      </w:pPr>
+    </w:p>
+    <w:p>
+      <w:pPr>
+        <w:pStyle w:val="Code"/>
+      </w:pPr>
+    </w:p>
+    <w:p>
+      <w:pPr>
+        <w:pStyle w:val="Code"/>
+      </w:pPr>
+    </w:p>
+    <w:p>
+      <w:pPr>
+        <w:pStyle w:val="Code"/>
+      </w:pPr>
+    </w:p>
+    <w:p>
+      <w:pPr>
+        <w:pStyle w:val="Code"/>
+      </w:pPr>
+    </w:p>
+    <w:p>
+      <w:pPr>
+        <w:pStyle w:val="Code"/>
+      </w:pPr>
+    </w:p>
+    <w:p>
+      <w:pPr>
+        <w:pStyle w:val="Code"/>
+      </w:pPr>
+    </w:p>
+    <w:p>
+      <w:pPr>
+        <w:pStyle w:val="Code"/>
+      </w:pPr>
+    </w:p>
+    <w:p>
+      <w:pPr>
         <w:rPr>
           <w:b/>
-          <w:lang w:val="es-CO"/>
         </w:rPr>
+      </w:pPr>
+    </w:p>
+    <w:p>
+      <w:pPr>
+        <w:rPr>
+          <w:b/>
+        </w:rPr>
+      </w:pPr>
+    </w:p>
+    <w:p>
+      <w:pPr>
+        <w:rPr>
+          <w:b/>
+        </w:rPr>
+      </w:pPr>
+    </w:p>
+    <w:p>
+      <w:pPr>
+        <w:rPr>
+          <w:b/>
+        </w:rPr>
+      </w:pPr>
+    </w:p>
+    <w:p>
+      <w:pPr>
+        <w:rPr>
+          <w:b/>
+        </w:rPr>
+      </w:pPr>
+    </w:p>
+    <w:p>
+      <w:r>
+        <w:rPr>
+          <w:b/>
+        </w:rPr>
+        <w:lastRenderedPageBreak/>
         <w:t>Estructura de carpetas propuesta:</w:t>
       </w:r>
     </w:p>
     <w:p>
       <w:pPr>
         <w:pStyle w:val="Code"/>
-        <w:rPr>
-          <w:lang w:val="es-CO"/>
-        </w:rPr>
       </w:pPr>
       <w:proofErr w:type="spellStart"/>
       <w:r>
-        <w:rPr>
-          <w:lang w:val="es-CO"/>
-        </w:rPr>
         <w:t>sge</w:t>
       </w:r>
       <w:proofErr w:type="spellEnd"/>
       <w:r>
-        <w:rPr>
-          <w:lang w:val="es-CO"/>
-        </w:rPr>
         <w:t>/</w:t>
       </w:r>
       <w:r>
-        <w:rPr>
-          <w:lang w:val="es-CO"/>
-        </w:rPr>
         <w:br/>
         <w:t xml:space="preserve">├── </w:t>
       </w:r>
       <w:proofErr w:type="spellStart"/>
       <w:r>
-        <w:rPr>
-          <w:lang w:val="es-CO"/>
-        </w:rPr>
         <w:t>docs</w:t>
       </w:r>
       <w:proofErr w:type="spellEnd"/>
       <w:r>
-        <w:rPr>
-          <w:lang w:val="es-CO"/>
-        </w:rPr>
         <w:t>/               # documentación y diagramas UML</w:t>
       </w:r>
       <w:r>
-        <w:rPr>
-          <w:lang w:val="es-CO"/>
-        </w:rPr>
         <w:br/>
         <w:t xml:space="preserve">├── </w:t>
       </w:r>
       <w:proofErr w:type="spellStart"/>
       <w:r>
-        <w:rPr>
-          <w:lang w:val="es-CO"/>
-        </w:rPr>
         <w:t>src</w:t>
       </w:r>
       <w:proofErr w:type="spellEnd"/>
       <w:r>
-        <w:rPr>
-          <w:lang w:val="es-CO"/>
-        </w:rPr>
         <w:t>/</w:t>
       </w:r>
       <w:r>
-        <w:rPr>
-          <w:lang w:val="es-CO"/>
-        </w:rPr>
         <w:br/>
         <w:t>│   ├── modelos/        # clases: Usuario, Estudiante, Curso, Matricula...</w:t>
       </w:r>
       <w:r>
-        <w:rPr>
-          <w:lang w:val="es-CO"/>
-        </w:rPr>
         <w:br/>
         <w:t>│   ├── servicios/      # lógica de negocio</w:t>
       </w:r>
       <w:r>
-        <w:rPr>
-          <w:lang w:val="es-CO"/>
-        </w:rPr>
         <w:br/>
         <w:t>│   ├── repositorios/   # acceso a datos</w:t>
       </w:r>
       <w:r>
-        <w:rPr>
-          <w:lang w:val="es-CO"/>
-        </w:rPr>
         <w:br/>
         <w:t>│   └── interfaz/       # pantallas o consola</w:t>
       </w:r>
       <w:r>
-        <w:rPr>
-          <w:lang w:val="es-CO"/>
-        </w:rPr>
         <w:br/>
         <w:t xml:space="preserve">├── </w:t>
       </w:r>
       <w:proofErr w:type="spellStart"/>
       <w:r>
-        <w:rPr>
-          <w:lang w:val="es-CO"/>
-        </w:rPr>
         <w:t>tests</w:t>
       </w:r>
       <w:proofErr w:type="spellEnd"/>
       <w:r>
-        <w:rPr>
-          <w:lang w:val="es-CO"/>
-        </w:rPr>
         <w:t>/              # pruebas unitarias</w:t>
       </w:r>
       <w:r>
-        <w:rPr>
-          <w:lang w:val="es-CO"/>
-        </w:rPr>
         <w:br/>
         <w:t>├── requirements.txt</w:t>
       </w:r>
       <w:r>
-        <w:rPr>
-          <w:lang w:val="es-CO"/>
-        </w:rPr>
         <w:br/>
         <w:t>└── README.md</w:t>
       </w:r>
@@ -2427,24 +1975,27 @@
     <w:p>
       <w:pPr>
         <w:pStyle w:val="Ttulo2"/>
-        <w:rPr>
-          <w:lang w:val="es-CO"/>
-        </w:rPr>
+      </w:pPr>
+      <w:r>
+        <w:t>3. Diagramas UML</w:t>
+      </w:r>
+    </w:p>
+    <w:p>
+      <w:pPr>
+        <w:pStyle w:val="Ttulo2"/>
       </w:pPr>
       <w:r>
         <w:rPr>
           <w:b w:val="0"/>
-          <w:noProof/>
-          <w:lang w:val="es-CO"/>
         </w:rPr>
         <w:drawing>
-          <wp:anchor distT="0" distB="0" distL="114300" distR="114300" simplePos="0" relativeHeight="251662336" behindDoc="0" locked="0" layoutInCell="1" allowOverlap="1" wp14:anchorId="46C1196A" wp14:editId="253747D3">
+          <wp:anchor distT="0" distB="0" distL="114300" distR="114300" simplePos="0" relativeHeight="251653120" behindDoc="0" locked="0" layoutInCell="1" allowOverlap="1" wp14:anchorId="46C1196A" wp14:editId="7A25CA8F">
             <wp:simplePos x="0" y="0"/>
             <wp:positionH relativeFrom="column">
-              <wp:posOffset>2385060</wp:posOffset>
+              <wp:posOffset>2169333</wp:posOffset>
             </wp:positionH>
             <wp:positionV relativeFrom="paragraph">
-              <wp:posOffset>353060</wp:posOffset>
+              <wp:posOffset>191886</wp:posOffset>
             </wp:positionV>
             <wp:extent cx="1964690" cy="6438900"/>
             <wp:effectExtent l="0" t="0" r="0" b="0"/>
@@ -2501,183 +2052,50 @@
         </w:drawing>
       </w:r>
       <w:r>
-        <w:rPr>
-          <w:lang w:val="es-CO"/>
-        </w:rPr>
-        <w:t>3. Diagramas UML</w:t>
-      </w:r>
-    </w:p>
-    <w:p>
-      <w:pPr>
-        <w:pStyle w:val="Ttulo2"/>
-        <w:rPr>
-          <w:lang w:val="es-CO"/>
-        </w:rPr>
-      </w:pPr>
-      <w:r>
-        <w:rPr>
-          <w:lang w:val="es-CO"/>
-        </w:rPr>
         <w:t>3.1 Diagrama de casos de uso</w:t>
       </w:r>
     </w:p>
-    <w:p>
-      <w:pPr>
-        <w:rPr>
-          <w:lang w:val="es-CO"/>
-        </w:rPr>
-      </w:pPr>
-    </w:p>
-    <w:p>
-      <w:pPr>
-        <w:rPr>
-          <w:lang w:val="es-CO"/>
-        </w:rPr>
-      </w:pPr>
-    </w:p>
-    <w:p>
-      <w:pPr>
-        <w:rPr>
-          <w:lang w:val="es-CO"/>
-        </w:rPr>
-      </w:pPr>
-    </w:p>
-    <w:p>
-      <w:pPr>
-        <w:rPr>
-          <w:lang w:val="es-CO"/>
-        </w:rPr>
-      </w:pPr>
-    </w:p>
-    <w:p>
-      <w:pPr>
-        <w:rPr>
-          <w:lang w:val="es-CO"/>
-        </w:rPr>
-      </w:pPr>
-    </w:p>
-    <w:p>
-      <w:pPr>
-        <w:rPr>
-          <w:lang w:val="es-CO"/>
-        </w:rPr>
-      </w:pPr>
-    </w:p>
-    <w:p>
-      <w:pPr>
-        <w:rPr>
-          <w:lang w:val="es-CO"/>
-        </w:rPr>
-      </w:pPr>
-    </w:p>
-    <w:p>
-      <w:pPr>
-        <w:rPr>
-          <w:lang w:val="es-CO"/>
-        </w:rPr>
-      </w:pPr>
-    </w:p>
-    <w:p>
-      <w:pPr>
-        <w:rPr>
-          <w:lang w:val="es-CO"/>
-        </w:rPr>
-      </w:pPr>
-    </w:p>
+    <w:p/>
+    <w:p/>
+    <w:p/>
+    <w:p/>
+    <w:p/>
+    <w:p/>
+    <w:p/>
+    <w:p/>
+    <w:p/>
     <w:p>
       <w:pPr>
         <w:pStyle w:val="Ttulo3"/>
-        <w:rPr>
-          <w:lang w:val="es-CO"/>
-        </w:rPr>
-      </w:pPr>
-    </w:p>
-    <w:p>
-      <w:pPr>
-        <w:rPr>
-          <w:lang w:val="es-CO"/>
-        </w:rPr>
-      </w:pPr>
-    </w:p>
-    <w:p>
-      <w:pPr>
-        <w:rPr>
-          <w:lang w:val="es-CO"/>
-        </w:rPr>
-      </w:pPr>
-    </w:p>
-    <w:p>
-      <w:pPr>
-        <w:rPr>
-          <w:lang w:val="es-CO"/>
-        </w:rPr>
-      </w:pPr>
-    </w:p>
-    <w:p>
-      <w:pPr>
-        <w:rPr>
-          <w:lang w:val="es-CO"/>
-        </w:rPr>
-      </w:pPr>
-    </w:p>
-    <w:p>
-      <w:pPr>
-        <w:rPr>
-          <w:lang w:val="es-CO"/>
-        </w:rPr>
-      </w:pPr>
-    </w:p>
-    <w:p>
-      <w:pPr>
-        <w:rPr>
-          <w:lang w:val="es-CO"/>
-        </w:rPr>
-      </w:pPr>
-    </w:p>
-    <w:p>
-      <w:pPr>
-        <w:rPr>
-          <w:lang w:val="es-CO"/>
-        </w:rPr>
-      </w:pPr>
-    </w:p>
+      </w:pPr>
+    </w:p>
+    <w:p/>
+    <w:p/>
+    <w:p/>
+    <w:p/>
+    <w:p/>
+    <w:p/>
+    <w:p/>
     <w:p>
       <w:pPr>
         <w:pStyle w:val="Ttulo3"/>
-        <w:rPr>
-          <w:lang w:val="es-CO"/>
-        </w:rPr>
       </w:pPr>
       <w:bookmarkStart w:id="1" w:name="bongo_lang_mermaid_2"/>
       <w:bookmarkEnd w:id="1"/>
-      <w:r>
-        <w:rPr>
-          <w:lang w:val="es-CO"/>
-        </w:rPr>
-        <w:lastRenderedPageBreak/>
+    </w:p>
+    <w:p>
+      <w:pPr>
+        <w:pStyle w:val="Ttulo3"/>
+      </w:pPr>
+      <w:r>
         <w:t>3.2 Diagrama de clases</w:t>
       </w:r>
     </w:p>
-    <w:p>
-      <w:pPr>
-        <w:rPr>
-          <w:lang w:val="es-CO"/>
-        </w:rPr>
-      </w:pPr>
-    </w:p>
-    <w:p>
-      <w:pPr>
-        <w:rPr>
-          <w:lang w:val="es-CO"/>
-        </w:rPr>
-      </w:pPr>
-      <w:r>
-        <w:rPr>
-          <w:noProof/>
-          <w:lang w:val="es-CO"/>
-        </w:rPr>
+    <w:p/>
+    <w:p>
+      <w:r>
         <w:drawing>
-          <wp:anchor distT="0" distB="0" distL="114300" distR="114300" simplePos="0" relativeHeight="251667456" behindDoc="0" locked="0" layoutInCell="1" allowOverlap="1" wp14:anchorId="236B8CB3" wp14:editId="00D2DF42">
+          <wp:anchor distT="0" distB="0" distL="114300" distR="114300" simplePos="0" relativeHeight="251654144" behindDoc="0" locked="0" layoutInCell="1" allowOverlap="1" wp14:anchorId="236B8CB3" wp14:editId="00D2DF42">
             <wp:simplePos x="0" y="0"/>
             <wp:positionH relativeFrom="column">
               <wp:posOffset>762000</wp:posOffset>
@@ -2740,254 +2158,65 @@
         </w:drawing>
       </w:r>
     </w:p>
-    <w:p>
-      <w:pPr>
-        <w:rPr>
-          <w:lang w:val="es-CO"/>
-        </w:rPr>
-      </w:pPr>
-    </w:p>
-    <w:p>
-      <w:pPr>
-        <w:rPr>
-          <w:lang w:val="es-CO"/>
-        </w:rPr>
-      </w:pPr>
-    </w:p>
-    <w:p>
-      <w:pPr>
-        <w:rPr>
-          <w:lang w:val="es-CO"/>
-        </w:rPr>
-      </w:pPr>
-    </w:p>
-    <w:p>
-      <w:pPr>
-        <w:rPr>
-          <w:lang w:val="es-CO"/>
-        </w:rPr>
-      </w:pPr>
-    </w:p>
-    <w:p>
-      <w:pPr>
-        <w:rPr>
-          <w:lang w:val="es-CO"/>
-        </w:rPr>
-      </w:pPr>
-    </w:p>
-    <w:p>
-      <w:pPr>
-        <w:rPr>
-          <w:lang w:val="es-CO"/>
-        </w:rPr>
-      </w:pPr>
-    </w:p>
-    <w:p>
-      <w:pPr>
-        <w:rPr>
-          <w:lang w:val="es-CO"/>
-        </w:rPr>
-      </w:pPr>
-    </w:p>
-    <w:p>
-      <w:pPr>
-        <w:rPr>
-          <w:lang w:val="es-CO"/>
-        </w:rPr>
-      </w:pPr>
-    </w:p>
-    <w:p>
-      <w:pPr>
-        <w:rPr>
-          <w:lang w:val="es-CO"/>
-        </w:rPr>
-      </w:pPr>
-    </w:p>
-    <w:p>
-      <w:pPr>
-        <w:rPr>
-          <w:lang w:val="es-CO"/>
-        </w:rPr>
-      </w:pPr>
-    </w:p>
-    <w:p>
-      <w:pPr>
-        <w:rPr>
-          <w:lang w:val="es-CO"/>
-        </w:rPr>
-      </w:pPr>
-    </w:p>
-    <w:p>
-      <w:pPr>
-        <w:rPr>
-          <w:lang w:val="es-CO"/>
-        </w:rPr>
-      </w:pPr>
-    </w:p>
-    <w:p>
-      <w:pPr>
-        <w:rPr>
-          <w:lang w:val="es-CO"/>
-        </w:rPr>
-      </w:pPr>
-    </w:p>
-    <w:p>
-      <w:pPr>
-        <w:rPr>
-          <w:lang w:val="es-CO"/>
-        </w:rPr>
-      </w:pPr>
-    </w:p>
-    <w:p>
-      <w:pPr>
-        <w:rPr>
-          <w:lang w:val="es-CO"/>
-        </w:rPr>
-      </w:pPr>
-    </w:p>
-    <w:p>
-      <w:pPr>
-        <w:rPr>
-          <w:lang w:val="es-CO"/>
-        </w:rPr>
-      </w:pPr>
-    </w:p>
-    <w:p>
-      <w:pPr>
-        <w:rPr>
-          <w:lang w:val="es-CO"/>
-        </w:rPr>
-      </w:pPr>
-    </w:p>
-    <w:p>
-      <w:pPr>
-        <w:rPr>
-          <w:lang w:val="es-CO"/>
-        </w:rPr>
-      </w:pPr>
-    </w:p>
-    <w:p>
-      <w:pPr>
-        <w:rPr>
-          <w:lang w:val="es-CO"/>
-        </w:rPr>
-      </w:pPr>
-    </w:p>
-    <w:p>
-      <w:pPr>
-        <w:rPr>
-          <w:lang w:val="es-CO"/>
-        </w:rPr>
-      </w:pPr>
-    </w:p>
-    <w:p>
-      <w:pPr>
-        <w:rPr>
-          <w:lang w:val="es-CO"/>
-        </w:rPr>
-      </w:pPr>
-    </w:p>
-    <w:p>
-      <w:pPr>
-        <w:rPr>
-          <w:lang w:val="es-CO"/>
-        </w:rPr>
-      </w:pPr>
-    </w:p>
-    <w:p>
-      <w:pPr>
-        <w:rPr>
-          <w:lang w:val="es-CO"/>
-        </w:rPr>
-      </w:pPr>
-    </w:p>
-    <w:p>
-      <w:pPr>
-        <w:rPr>
-          <w:lang w:val="es-CO"/>
-        </w:rPr>
-      </w:pPr>
-    </w:p>
-    <w:p>
-      <w:pPr>
-        <w:rPr>
-          <w:lang w:val="es-CO"/>
-        </w:rPr>
-      </w:pPr>
-    </w:p>
+    <w:p/>
+    <w:p/>
+    <w:p/>
+    <w:p/>
+    <w:p/>
+    <w:p/>
+    <w:p/>
+    <w:p/>
+    <w:p/>
+    <w:p/>
+    <w:p/>
+    <w:p/>
+    <w:p/>
+    <w:p/>
+    <w:p/>
+    <w:p/>
+    <w:p/>
+    <w:p/>
+    <w:p/>
+    <w:p/>
+    <w:p/>
+    <w:p/>
+    <w:p/>
+    <w:p/>
+    <w:p/>
     <w:p>
       <w:pPr>
         <w:pStyle w:val="Ttulo3"/>
-        <w:rPr>
-          <w:lang w:val="es-CO"/>
-        </w:rPr>
       </w:pPr>
       <w:bookmarkStart w:id="2" w:name="bongo_lang_mermaid_3"/>
       <w:bookmarkEnd w:id="2"/>
       <w:r>
-        <w:rPr>
-          <w:lang w:val="es-CO"/>
-        </w:rPr>
         <w:lastRenderedPageBreak/>
         <w:t xml:space="preserve">3.3 Diagrama de secuencia: </w:t>
       </w:r>
       <w:r>
-        <w:rPr>
-          <w:lang w:val="es-CO"/>
-        </w:rPr>
         <w:t xml:space="preserve">gestionar </w:t>
       </w:r>
       <w:r>
-        <w:rPr>
-          <w:lang w:val="es-CO"/>
-        </w:rPr>
         <w:t>estudiante</w:t>
       </w:r>
       <w:r>
-        <w:rPr>
-          <w:lang w:val="es-CO"/>
-        </w:rPr>
         <w:t>s</w:t>
       </w:r>
       <w:r>
-        <w:rPr>
-          <w:lang w:val="es-CO"/>
-        </w:rPr>
         <w:t xml:space="preserve"> (CU-0</w:t>
       </w:r>
       <w:r>
-        <w:rPr>
-          <w:lang w:val="es-CO"/>
-        </w:rPr>
         <w:t>2</w:t>
       </w:r>
       <w:r>
-        <w:rPr>
-          <w:lang w:val="es-CO"/>
-        </w:rPr>
         <w:t>)</w:t>
       </w:r>
     </w:p>
-    <w:p>
-      <w:pPr>
-        <w:rPr>
-          <w:lang w:val="es-CO"/>
-        </w:rPr>
-      </w:pPr>
-    </w:p>
-    <w:p>
-      <w:pPr>
-        <w:rPr>
-          <w:lang w:val="es-CO"/>
-        </w:rPr>
-      </w:pPr>
-      <w:r>
-        <w:rPr>
-          <w:noProof/>
-          <w:lang w:val="es-CO"/>
-        </w:rPr>
+    <w:p/>
+    <w:p>
+      <w:r>
         <w:drawing>
-          <wp:anchor distT="0" distB="0" distL="114300" distR="114300" simplePos="0" relativeHeight="251668480" behindDoc="0" locked="0" layoutInCell="1" allowOverlap="1" wp14:anchorId="210D1E1B" wp14:editId="19AF1836">
+          <wp:anchor distT="0" distB="0" distL="114300" distR="114300" simplePos="0" relativeHeight="251655168" behindDoc="0" locked="0" layoutInCell="1" allowOverlap="1" wp14:anchorId="210D1E1B" wp14:editId="19AF1836">
             <wp:simplePos x="0" y="0"/>
             <wp:positionH relativeFrom="column">
               <wp:posOffset>-289560</wp:posOffset>
@@ -3044,100 +2273,29 @@
         </w:drawing>
       </w:r>
     </w:p>
-    <w:p>
-      <w:pPr>
-        <w:rPr>
-          <w:lang w:val="es-CO"/>
-        </w:rPr>
-      </w:pPr>
-    </w:p>
-    <w:p>
-      <w:pPr>
-        <w:rPr>
-          <w:lang w:val="es-CO"/>
-        </w:rPr>
-      </w:pPr>
-    </w:p>
-    <w:p>
-      <w:pPr>
-        <w:rPr>
-          <w:lang w:val="es-CO"/>
-        </w:rPr>
-      </w:pPr>
-    </w:p>
-    <w:p>
-      <w:pPr>
-        <w:rPr>
-          <w:lang w:val="es-CO"/>
-        </w:rPr>
-      </w:pPr>
-    </w:p>
-    <w:p>
-      <w:pPr>
-        <w:rPr>
-          <w:lang w:val="es-CO"/>
-        </w:rPr>
-      </w:pPr>
-    </w:p>
-    <w:p>
-      <w:pPr>
-        <w:rPr>
-          <w:lang w:val="es-CO"/>
-        </w:rPr>
-      </w:pPr>
-    </w:p>
-    <w:p>
-      <w:pPr>
-        <w:rPr>
-          <w:lang w:val="es-CO"/>
-        </w:rPr>
-      </w:pPr>
-    </w:p>
-    <w:p>
-      <w:pPr>
-        <w:rPr>
-          <w:lang w:val="es-CO"/>
-        </w:rPr>
-      </w:pPr>
-    </w:p>
+    <w:p/>
+    <w:p/>
+    <w:p/>
+    <w:p/>
+    <w:p/>
+    <w:p/>
+    <w:p/>
+    <w:p/>
     <w:p>
       <w:pPr>
         <w:pStyle w:val="Ttulo2"/>
-        <w:rPr>
-          <w:lang w:val="es-CO"/>
-        </w:rPr>
       </w:pPr>
       <w:bookmarkStart w:id="3" w:name="bongo_lang_mermaid_4"/>
       <w:bookmarkEnd w:id="3"/>
     </w:p>
-    <w:p>
-      <w:pPr>
-        <w:rPr>
-          <w:lang w:val="es-CO"/>
-        </w:rPr>
-      </w:pPr>
-    </w:p>
-    <w:p>
-      <w:pPr>
-        <w:rPr>
-          <w:lang w:val="es-CO"/>
-        </w:rPr>
-      </w:pPr>
-    </w:p>
-    <w:p>
-      <w:pPr>
-        <w:rPr>
-          <w:lang w:val="es-CO"/>
-        </w:rPr>
-      </w:pPr>
-    </w:p>
-    <w:p>
-      <w:pPr>
-        <w:rPr>
-          <w:lang w:val="es-CO"/>
-        </w:rPr>
-      </w:pPr>
-    </w:p>
+    <w:p/>
+    <w:p/>
+    <w:p/>
+    <w:p/>
+    <w:p/>
+    <w:p/>
+    <w:p/>
+    <w:p/>
     <w:p>
       <w:pPr>
         <w:pStyle w:val="Ttulo2"/>
@@ -3146,29 +2304,8 @@
         <w:t>4</w:t>
       </w:r>
       <w:r>
-        <w:t xml:space="preserve">. </w:t>
-      </w:r>
-      <w:proofErr w:type="spellStart"/>
-      <w:r>
-        <w:t>Posibles</w:t>
-      </w:r>
-      <w:proofErr w:type="spellEnd"/>
-      <w:r>
-        <w:t xml:space="preserve"> </w:t>
-      </w:r>
-      <w:proofErr w:type="spellStart"/>
-      <w:r>
-        <w:t>mejoras</w:t>
-      </w:r>
-      <w:proofErr w:type="spellEnd"/>
-      <w:r>
-        <w:t xml:space="preserve"> </w:t>
-      </w:r>
-      <w:proofErr w:type="spellStart"/>
-      <w:r>
-        <w:t>futuras</w:t>
-      </w:r>
-      <w:proofErr w:type="spellEnd"/>
+        <w:t>. Posibles mejoras futuras</w:t>
+      </w:r>
     </w:p>
     <w:p>
       <w:pPr>
@@ -3177,14 +2314,8 @@
           <w:ilvl w:val="0"/>
           <w:numId w:val="3"/>
         </w:numPr>
-        <w:rPr>
-          <w:lang w:val="es-CO"/>
-        </w:rPr>
-      </w:pPr>
-      <w:r>
-        <w:rPr>
-          <w:lang w:val="es-CO"/>
-        </w:rPr>
+      </w:pPr>
+      <w:r>
         <w:t>Control de asistencia y notificaciones por correo.</w:t>
       </w:r>
     </w:p>
@@ -3196,29 +2327,8 @@
           <w:numId w:val="3"/>
         </w:numPr>
       </w:pPr>
-      <w:proofErr w:type="spellStart"/>
-      <w:r>
-        <w:t>Periodos</w:t>
-      </w:r>
-      <w:proofErr w:type="spellEnd"/>
-      <w:r>
-        <w:t xml:space="preserve"> </w:t>
-      </w:r>
-      <w:proofErr w:type="spellStart"/>
-      <w:r>
-        <w:t>académicos</w:t>
-      </w:r>
-      <w:proofErr w:type="spellEnd"/>
-      <w:r>
-        <w:t xml:space="preserve"> y </w:t>
-      </w:r>
-      <w:proofErr w:type="spellStart"/>
-      <w:r>
-        <w:t>horarios</w:t>
-      </w:r>
-      <w:proofErr w:type="spellEnd"/>
-      <w:r>
-        <w:t>.</w:t>
+      <w:r>
+        <w:t>Periodos académicos y horarios.</w:t>
       </w:r>
     </w:p>
     <w:p>
@@ -3228,14 +2338,8 @@
           <w:ilvl w:val="0"/>
           <w:numId w:val="3"/>
         </w:numPr>
-        <w:rPr>
-          <w:lang w:val="es-CO"/>
-        </w:rPr>
-      </w:pPr>
-      <w:r>
-        <w:rPr>
-          <w:lang w:val="es-CO"/>
-        </w:rPr>
+      </w:pPr>
+      <w:r>
         <w:t>Diagramas de actividades y de componentes.</w:t>
       </w:r>
     </w:p>
@@ -3246,14 +2350,8 @@
           <w:ilvl w:val="0"/>
           <w:numId w:val="3"/>
         </w:numPr>
-        <w:rPr>
-          <w:lang w:val="es-CO"/>
-        </w:rPr>
-      </w:pPr>
-      <w:r>
-        <w:rPr>
-          <w:lang w:val="es-CO"/>
-        </w:rPr>
+      </w:pPr>
+      <w:r>
         <w:t>Pruebas automatizadas y despliegue en la nube.</w:t>
       </w:r>
     </w:p>
@@ -3263,6 +2361,7 @@
       </w:pPr>
     </w:p>
     <w:sectPr>
+      <w:headerReference w:type="default" r:id="rId11"/>
       <w:pgSz w:w="12240" w:h="15840"/>
       <w:pgMar w:top="1440" w:right="1440" w:bottom="1440" w:left="1440" w:header="720" w:footer="720" w:gutter="0"/>
       <w:cols w:space="720"/>
@@ -3319,6 +2418,76 @@
     </w:p>
   </w:footnote>
 </w:footnotes>
+</file>
+
+<file path=word/header1.xml><?xml version="1.0" encoding="utf-8"?>
+<w:hdr xmlns:wpc="http://schemas.microsoft.com/office/word/2010/wordprocessingCanvas" xmlns:cx="http://schemas.microsoft.com/office/drawing/2014/chartex" xmlns:cx1="http://schemas.microsoft.com/office/drawing/2015/9/8/chartex" xmlns:cx2="http://schemas.microsoft.com/office/drawing/2015/10/21/chartex" xmlns:cx3="http://schemas.microsoft.com/office/drawing/2016/5/9/chartex" xmlns:cx4="http://schemas.microsoft.com/office/drawing/2016/5/10/chartex" xmlns:cx5="http://schemas.microsoft.com/office/drawing/2016/5/11/chartex" xmlns:cx6="http://schemas.microsoft.com/office/drawing/2016/5/12/chartex" xmlns:cx7="http://schemas.microsoft.com/office/drawing/2016/5/13/chartex" xmlns:cx8="http://schemas.microsoft.com/office/drawing/2016/5/14/chartex" xmlns:mc="http://schemas.openxmlformats.org/markup-compatibility/2006" xmlns:aink="http://schemas.microsoft.com/office/drawing/2016/ink" xmlns:am3d="http://schemas.microsoft.com/office/drawing/2017/model3d" xmlns:o="urn:schemas-microsoft-com:office:office" xmlns:oel="http://schemas.microsoft.com/office/2019/extlst" xmlns:r="http://schemas.openxmlformats.org/officeDocument/2006/relationships" xmlns:m="http://schemas.openxmlformats.org/officeDocument/2006/math" xmlns:v="urn:schemas-microsoft-com:vml" xmlns:wp14="http://schemas.microsoft.com/office/word/2010/wordprocessingDrawing" xmlns:wp="http://schemas.openxmlformats.org/drawingml/2006/wordprocessingDrawing" xmlns:w10="urn:schemas-microsoft-com:office:word" xmlns:w="http://schemas.openxmlformats.org/wordprocessingml/2006/main" xmlns:w14="http://schemas.microsoft.com/office/word/2010/wordml" xmlns:w15="http://schemas.microsoft.com/office/word/2012/wordml" xmlns:w16cex="http://schemas.microsoft.com/office/word/2018/wordml/cex" xmlns:w16cid="http://schemas.microsoft.com/office/word/2016/wordml/cid" xmlns:w16="http://schemas.microsoft.com/office/word/2018/wordml" xmlns:w16du="http://schemas.microsoft.com/office/word/2023/wordml/word16du" xmlns:w16sdtdh="http://schemas.microsoft.com/office/word/2020/wordml/sdtdatahash" xmlns:w16sdtfl="http://schemas.microsoft.com/office/word/2024/wordml/sdtformatlock" xmlns:w16se="http://schemas.microsoft.com/office/word/2015/wordml/symex" xmlns:wpg="http://schemas.microsoft.com/office/word/2010/wordprocessingGroup" xmlns:wpi="http://schemas.microsoft.com/office/word/2010/wordprocessingInk" xmlns:wne="http://schemas.microsoft.com/office/word/2006/wordml" xmlns:wps="http://schemas.microsoft.com/office/word/2010/wordprocessingShape" mc:Ignorable="w14 w15 w16se w16cid w16 w16cex w16sdtdh w16sdtfl w16du wp14">
+  <w:p>
+    <w:pPr>
+      <w:pStyle w:val="Encabezado"/>
+    </w:pPr>
+    <w:r>
+      <w:rPr>
+        <w:noProof/>
+      </w:rPr>
+      <w:drawing>
+        <wp:anchor distT="0" distB="0" distL="114300" distR="114300" simplePos="0" relativeHeight="251658240" behindDoc="0" locked="0" layoutInCell="1" allowOverlap="1" wp14:anchorId="4FDBC7A1" wp14:editId="2AB750D4">
+          <wp:simplePos x="0" y="0"/>
+          <wp:positionH relativeFrom="column">
+            <wp:posOffset>4904509</wp:posOffset>
+          </wp:positionH>
+          <wp:positionV relativeFrom="paragraph">
+            <wp:posOffset>-526474</wp:posOffset>
+          </wp:positionV>
+          <wp:extent cx="2034425" cy="1149611"/>
+          <wp:effectExtent l="0" t="0" r="0" b="0"/>
+          <wp:wrapNone/>
+          <wp:docPr id="1783805878" name="Imagen 1"/>
+          <wp:cNvGraphicFramePr>
+            <a:graphicFrameLocks xmlns:a="http://schemas.openxmlformats.org/drawingml/2006/main" noChangeAspect="1"/>
+          </wp:cNvGraphicFramePr>
+          <a:graphic xmlns:a="http://schemas.openxmlformats.org/drawingml/2006/main">
+            <a:graphicData uri="http://schemas.openxmlformats.org/drawingml/2006/picture">
+              <pic:pic xmlns:pic="http://schemas.openxmlformats.org/drawingml/2006/picture">
+                <pic:nvPicPr>
+                  <pic:cNvPr id="1783805878" name="Imagen 1783805878"/>
+                  <pic:cNvPicPr/>
+                </pic:nvPicPr>
+                <pic:blipFill>
+                  <a:blip r:embed="rId1">
+                    <a:extLst>
+                      <a:ext uri="{28A0092B-C50C-407E-A947-70E740481C1C}">
+                        <a14:useLocalDpi xmlns:a14="http://schemas.microsoft.com/office/drawing/2010/main" val="0"/>
+                      </a:ext>
+                    </a:extLst>
+                  </a:blip>
+                  <a:stretch>
+                    <a:fillRect/>
+                  </a:stretch>
+                </pic:blipFill>
+                <pic:spPr>
+                  <a:xfrm>
+                    <a:off x="0" y="0"/>
+                    <a:ext cx="2042545" cy="1154199"/>
+                  </a:xfrm>
+                  <a:prstGeom prst="rect">
+                    <a:avLst/>
+                  </a:prstGeom>
+                </pic:spPr>
+              </pic:pic>
+            </a:graphicData>
+          </a:graphic>
+          <wp14:sizeRelH relativeFrom="margin">
+            <wp14:pctWidth>0</wp14:pctWidth>
+          </wp14:sizeRelH>
+          <wp14:sizeRelV relativeFrom="margin">
+            <wp14:pctHeight>0</wp14:pctHeight>
+          </wp14:sizeRelV>
+        </wp:anchor>
+      </w:drawing>
+    </w:r>
+  </w:p>
+</w:hdr>
 </file>
 
 <file path=word/numbering.xml><?xml version="1.0" encoding="utf-8"?>
@@ -3905,6 +3074,9 @@
   <w:style w:type="paragraph" w:default="1" w:styleId="Normal">
     <w:name w:val="Normal"/>
     <w:qFormat/>
+    <w:rPr>
+      <w:lang w:val="es-CO"/>
+    </w:rPr>
   </w:style>
   <w:style w:type="paragraph" w:styleId="Ttulo1">
     <w:name w:val="heading 1"/>
@@ -4007,7 +3179,6 @@
   <w:style w:type="character" w:default="1" w:styleId="Fuentedeprrafopredeter">
     <w:name w:val="Default Paragraph Font"/>
     <w:uiPriority w:val="1"/>
-    <w:semiHidden/>
     <w:unhideWhenUsed/>
   </w:style>
   <w:style w:type="table" w:default="1" w:styleId="Tablanormal">

</xml_diff>